<commit_message>
Scope planting depth control to future work in the thesis
The seed dispensing mechanism is finalized around seed count and
spacing; depth control was not implemented within the project
timeline. Updates the research question, operational definition,
mechanism description, Chapter Four metrics table, limitations, and
future work list so the depth claim is consistent everywhere instead
of only appearing in some sections.
</commit_message>
<xml_diff>
--- a/docs/thesis/DESIGN_AND_GHANA_Final.docx
+++ b/docs/thesis/DESIGN_AND_GHANA_Final.docx
@@ -5254,7 +5254,7 @@
         <w:jc w:val="both"/>
       </w:pPr>
       <w:r>
-        <w:t>2. How consistently can the rover achieve target seed spacing, planting depth, and water delivery volumes using its low-cost dispensing and pumping mechanisms?</w:t>
+        <w:t>2. How consistently can the rover achieve target seed spacing and water delivery volumes using its low-cost dispensing and pumping mechanisms? Planting depth control was descoped from this study because of time constraints and is treated as future work in Chapter Five.</w:t>
       </w:r>
     </w:p>
     <w:p>
@@ -5349,7 +5349,7 @@
         <w:t xml:space="preserve">Precision seed dispensing: </w:t>
       </w:r>
       <w:r>
-        <w:t>Placing individual seeds at set spacing intervals and at a controlled depth to promote even germination and crop emergence across the field.</w:t>
+        <w:t>Placing individual seeds at set spacing intervals to promote even germination and crop emergence across the field. Depth control was not implemented in this study and is treated as future work.</w:t>
       </w:r>
     </w:p>
     <w:p>
@@ -10165,7 +10165,7 @@
         <w:jc w:val="both"/>
       </w:pPr>
       <w:r>
-        <w:t xml:space="preserve">Two mechanical subsystems sit on top of the chassis in addition to the drivetrain. The first is the seed dispensing mechanism, a servo-actuated metering gate mounted over the deck plate cutout that releases a measured number of seeds through a drop tube as the rover pauses at each planting point, in line with the target of three seeds per hole set out in the study's objectives. The second is a soil moisture probe arm, a small linkage driven by its own servo that plunges a capacitive soil moisture sensor into the ground at each stop and retracts it before the rover moves on, so that a moisture reading is available at every planting location without dragging a fixed probe through the soil continuously.</w:t>
+        <w:t xml:space="preserve">Two mechanical subsystems sit on top of the chassis in addition to the drivetrain. The first is the seed dispensing mechanism, a servo-actuated metering gate mounted over the deck plate cutout that releases a measured number of seeds through a drop tube as the rover pauses at each planting point, in line with the target of three seeds per hole set out in the study's objectives. This mechanism controls seed count and release timing, which sets the spacing between holes as the rover advances; it does not control the depth at which seeds settle once they leave the drop tube. Adding depth control was outside what the project's timeline allowed and is identified as future work in Chapter Five. The second is a soil moisture probe arm, a small linkage driven by its own servo that plunges a capacitive soil moisture sensor into the ground at each stop and retracts it before the rover moves on, so that a moisture reading is available at every planting location without dragging a fixed probe through the soil continuously.</w:t>
       </w:r>
     </w:p>
     <w:p>
@@ -15924,7 +15924,7 @@
                 <w:sz w:val="20"/>
                 <w:szCs w:val="20"/>
               </w:rPr>
-              <w:t xml:space="preserve">Consistent within a set tolerance</w:t>
+              <w:t xml:space="preserve">Descoped (see Section 5.5)</w:t>
             </w:r>
           </w:p>
         </w:tc>
@@ -15946,7 +15946,7 @@
                 <w:sz w:val="20"/>
                 <w:szCs w:val="20"/>
               </w:rPr>
-              <w:t xml:space="preserve">TBD</w:t>
+              <w:t xml:space="preserve">Not evaluated in this study</w:t>
             </w:r>
           </w:p>
         </w:tc>
@@ -16431,7 +16431,7 @@
         <w:jc w:val="both"/>
       </w:pPr>
       <w:r>
-        <w:t xml:space="preserve">Several limitations should be kept in mind when interpreting the design and results presented in this report. The rover's navigation relies on a standard GPS module without real-time kinematic correction, giving a position accuracy of roughly 1.5 to 3 metres that is not sufficient for crop-row-level precision on its own; the corridor-following strategy adopted works around this limitation rather than removing it. At the time of writing, the physical rover had not yet completed a full controlled field trial, so the navigation accuracy, seed placement consistency, and watering precision results presented in Chapter Four are structured as a protocol and template rather than as final measured outcomes. The power budget in Chapter Three is based on typical datasheet values rather than direct current measurement on the assembled rover. The design and its intended testing assume relatively flat, uniform terrain typical of a controlled test plot, and does not address the fuller range of slopes, obstructions, and soil conditions found across smallholder farms in Ghana generally. Cost constraints also ruled out LiDAR-based obstacle avoidance and single-board-computer-based control in favour of a single ultrasonic sensor and a single Arduino-class microcontroller, which limits the rover's ability to handle complex or cluttered field layouts. Finally, the study evaluates a single prototype rather than multiple units, so the results, once collected, will describe the behaviour of one build rather than a statistically validated population.</w:t>
+        <w:t xml:space="preserve">Several limitations should be kept in mind when interpreting the design and results presented in this report. The rover's navigation relies on a standard GPS module without real-time kinematic correction, giving a position accuracy of roughly 1.5 to 3 metres that is not sufficient for crop-row-level precision on its own; the corridor-following strategy adopted works around this limitation rather than removing it. At the time of writing, the physical rover had not yet completed a full controlled field trial, so the navigation accuracy, seed placement consistency, and watering precision results presented in Chapter Four are structured as a protocol and template rather than as final measured outcomes. Planting depth control was also descoped from the seed dispensing mechanism because of time constraints; the finalised mechanism controls seed count and spacing only, and depth control is left for future work. The power budget in Chapter Three is based on typical datasheet values rather than direct current measurement on the assembled rover. The design and its intended testing assume relatively flat, uniform terrain typical of a controlled test plot, and does not address the fuller range of slopes, obstructions, and soil conditions found across smallholder farms in Ghana generally. Cost constraints also ruled out LiDAR-based obstacle avoidance and single-board-computer-based control in favour of a single ultrasonic sensor and a single Arduino-class microcontroller, which limits the rover's ability to handle complex or cluttered field layouts. Finally, the study evaluates a single prototype rather than multiple units, so the results, once collected, will describe the behaviour of one build rather than a statistically validated population.</w:t>
       </w:r>
     </w:p>
     <w:p>
@@ -16512,6 +16512,16 @@
       </w:pPr>
       <w:r>
         <w:t xml:space="preserve">7. Extend field testing across a wider range of terrain, soil types, and seasons than the controlled test plot used in this study, to build confidence in the rover's reliability under the fuller range of conditions found on Ghanaian smallholder farms.</w:t>
+      </w:r>
+    </w:p>
+    <w:p>
+      <w:pPr>
+        <w:spacing w:after="120" w:line="360" w:lineRule="auto"/>
+        <w:ind w:left="720" w:hanging="360"/>
+        <w:jc w:val="both"/>
+      </w:pPr>
+      <w:r>
+        <w:t xml:space="preserve">8. Add depth control to the seed dispensing mechanism, for example through a depth-gauging drop tube or a linear actuator on the probe arm, and validate planting depth consistency against a defined tolerance. This was descoped from the current study because of time constraints and was not implemented or tested.</w:t>
       </w:r>
     </w:p>
     <w:p>

</xml_diff>

<commit_message>
Add photographic reference table for electronics components
Adds a new Table 3.4 with a photo, name, and short function note for
15 real components, sourced from the actual parts photographed for
this build. Two of those (a B25 voltage sensor module and a master
power rocker switch) were not previously itemised, so they are added
to the Table 3.2 Bill of Materials as well. Also corrects the drive
motor part number to JGA25-370 to match the part actually
photographed, in place of the previously listed 25GA-370.

Still pending real photos: the 12V battery pack and the assembled
chassis (Figure 3.2 remains a placeholder).
</commit_message>
<xml_diff>
--- a/docs/thesis/DESIGN_AND_GHANA_Final.docx
+++ b/docs/thesis/DESIGN_AND_GHANA_Final.docx
@@ -12300,7 +12300,7 @@
                 <w:sz w:val="20"/>
                 <w:szCs w:val="20"/>
               </w:rPr>
-              <w:t xml:space="preserve">25GA-370 DC gear motor</w:t>
+              <w:t xml:space="preserve">JGA25-370 DC gear motor</w:t>
             </w:r>
           </w:p>
         </w:tc>
@@ -13065,6 +13065,186 @@
                 <w:szCs w:val="20"/>
               </w:rPr>
               <w:t xml:space="preserve">Main power supply</w:t>
+            </w:r>
+          </w:p>
+        </w:tc>
+      </w:tr>
+      <w:tr>
+        <w:tc>
+          <w:tcPr>
+            <w:tcW w:w="2600" w:type="dxa"/>
+            <w:tcMar>
+              <w:top w:w="60" w:type="dxa"/>
+              <w:left w:w="100" w:type="dxa"/>
+              <w:bottom w:w="60" w:type="dxa"/>
+              <w:right w:w="100" w:type="dxa"/>
+            </w:tcMar>
+            <w:vAlign w:val="center"/>
+          </w:tcPr>
+          <w:p>
+            <w:pPr/>
+            <w:r>
+              <w:rPr>
+                <w:sz w:val="20"/>
+                <w:szCs w:val="20"/>
+              </w:rPr>
+              <w:t xml:space="preserve">Voltage sensor module</w:t>
+            </w:r>
+          </w:p>
+        </w:tc>
+        <w:tc>
+          <w:tcPr>
+            <w:tcW w:w="3400" w:type="dxa"/>
+            <w:tcMar>
+              <w:top w:w="60" w:type="dxa"/>
+              <w:left w:w="100" w:type="dxa"/>
+              <w:bottom w:w="60" w:type="dxa"/>
+              <w:right w:w="100" w:type="dxa"/>
+            </w:tcMar>
+            <w:vAlign w:val="center"/>
+          </w:tcPr>
+          <w:p>
+            <w:pPr/>
+            <w:r>
+              <w:rPr>
+                <w:sz w:val="20"/>
+                <w:szCs w:val="20"/>
+              </w:rPr>
+              <w:t xml:space="preserve">B25, 0-25V range</w:t>
+            </w:r>
+          </w:p>
+        </w:tc>
+        <w:tc>
+          <w:tcPr>
+            <w:tcW w:w="800" w:type="dxa"/>
+            <w:tcMar>
+              <w:top w:w="60" w:type="dxa"/>
+              <w:left w:w="100" w:type="dxa"/>
+              <w:bottom w:w="60" w:type="dxa"/>
+              <w:right w:w="100" w:type="dxa"/>
+            </w:tcMar>
+            <w:vAlign w:val="center"/>
+          </w:tcPr>
+          <w:p>
+            <w:pPr/>
+            <w:r>
+              <w:rPr>
+                <w:sz w:val="20"/>
+                <w:szCs w:val="20"/>
+              </w:rPr>
+              <w:t xml:space="preserve">1</w:t>
+            </w:r>
+          </w:p>
+        </w:tc>
+        <w:tc>
+          <w:tcPr>
+            <w:tcW w:w="2260" w:type="dxa"/>
+            <w:tcMar>
+              <w:top w:w="60" w:type="dxa"/>
+              <w:left w:w="100" w:type="dxa"/>
+              <w:bottom w:w="60" w:type="dxa"/>
+              <w:right w:w="100" w:type="dxa"/>
+            </w:tcMar>
+            <w:vAlign w:val="center"/>
+          </w:tcPr>
+          <w:p>
+            <w:pPr/>
+            <w:r>
+              <w:rPr>
+                <w:sz w:val="20"/>
+                <w:szCs w:val="20"/>
+              </w:rPr>
+              <w:t xml:space="preserve">Battery voltage divider feeding analogue pin A1</w:t>
+            </w:r>
+          </w:p>
+        </w:tc>
+      </w:tr>
+      <w:tr>
+        <w:tc>
+          <w:tcPr>
+            <w:tcW w:w="2600" w:type="dxa"/>
+            <w:tcMar>
+              <w:top w:w="60" w:type="dxa"/>
+              <w:left w:w="100" w:type="dxa"/>
+              <w:bottom w:w="60" w:type="dxa"/>
+              <w:right w:w="100" w:type="dxa"/>
+            </w:tcMar>
+            <w:vAlign w:val="center"/>
+          </w:tcPr>
+          <w:p>
+            <w:pPr/>
+            <w:r>
+              <w:rPr>
+                <w:sz w:val="20"/>
+                <w:szCs w:val="20"/>
+              </w:rPr>
+              <w:t xml:space="preserve">Power switch</w:t>
+            </w:r>
+          </w:p>
+        </w:tc>
+        <w:tc>
+          <w:tcPr>
+            <w:tcW w:w="3400" w:type="dxa"/>
+            <w:tcMar>
+              <w:top w:w="60" w:type="dxa"/>
+              <w:left w:w="100" w:type="dxa"/>
+              <w:bottom w:w="60" w:type="dxa"/>
+              <w:right w:w="100" w:type="dxa"/>
+            </w:tcMar>
+            <w:vAlign w:val="center"/>
+          </w:tcPr>
+          <w:p>
+            <w:pPr/>
+            <w:r>
+              <w:rPr>
+                <w:sz w:val="20"/>
+                <w:szCs w:val="20"/>
+              </w:rPr>
+              <w:t xml:space="preserve">Illuminated rocker switch, panel-mount</w:t>
+            </w:r>
+          </w:p>
+        </w:tc>
+        <w:tc>
+          <w:tcPr>
+            <w:tcW w:w="800" w:type="dxa"/>
+            <w:tcMar>
+              <w:top w:w="60" w:type="dxa"/>
+              <w:left w:w="100" w:type="dxa"/>
+              <w:bottom w:w="60" w:type="dxa"/>
+              <w:right w:w="100" w:type="dxa"/>
+            </w:tcMar>
+            <w:vAlign w:val="center"/>
+          </w:tcPr>
+          <w:p>
+            <w:pPr/>
+            <w:r>
+              <w:rPr>
+                <w:sz w:val="20"/>
+                <w:szCs w:val="20"/>
+              </w:rPr>
+              <w:t xml:space="preserve">1</w:t>
+            </w:r>
+          </w:p>
+        </w:tc>
+        <w:tc>
+          <w:tcPr>
+            <w:tcW w:w="2260" w:type="dxa"/>
+            <w:tcMar>
+              <w:top w:w="60" w:type="dxa"/>
+              <w:left w:w="100" w:type="dxa"/>
+              <w:bottom w:w="60" w:type="dxa"/>
+              <w:right w:w="100" w:type="dxa"/>
+            </w:tcMar>
+            <w:vAlign w:val="center"/>
+          </w:tcPr>
+          <w:p>
+            <w:pPr/>
+            <w:r>
+              <w:rPr>
+                <w:sz w:val="20"/>
+                <w:szCs w:val="20"/>
+              </w:rPr>
+              <w:t xml:space="preserve">Master on/off for the battery circuit</w:t>
             </w:r>
           </w:p>
         </w:tc>
@@ -13942,6 +14122,1701 @@
         <w:t xml:space="preserve"> Estimated power budget (datasheet-typical values, to be validated by measurement)</w:t>
       </w:r>
       <w:bookmarkEnd w:id="94"/>
+    </w:p>
+    <w:p>
+      <w:pPr>
+        <w:spacing w:after="200" w:line="360" w:lineRule="auto"/>
+        <w:jc w:val="both"/>
+      </w:pPr>
+      <w:r>
+        <w:t xml:space="preserve">Table 3.4 gives a photographic reference for the electronics components listed in Table 3.2, taken from the parts as purchased for the build. Two components, an illuminated rocker switch used as the master power switch and a B25 voltage sensor module used for the battery-sensing divider described in Section 3.4.2, are included here even though they were not itemised separately in Table 3.2; both are added to that table below for completeness.</w:t>
+      </w:r>
+    </w:p>
+    <w:tbl>
+      <w:tblPr>
+        <w:tblW w:w="9060" w:type="dxa"/>
+        <w:tblBorders>
+          <w:top w:val="single" w:sz="4" w:space="0" w:color="808080"/>
+          <w:left w:val="single" w:sz="4" w:space="0" w:color="808080"/>
+          <w:bottom w:val="single" w:sz="4" w:space="0" w:color="808080"/>
+          <w:right w:val="single" w:sz="4" w:space="0" w:color="808080"/>
+          <w:insideH w:val="single" w:sz="4" w:space="0" w:color="808080"/>
+          <w:insideV w:val="single" w:sz="4" w:space="0" w:color="808080"/>
+        </w:tblBorders>
+      </w:tblPr>
+      <w:tblGrid>
+        <w:gridCol w:w="1400"/>
+        <w:gridCol w:w="2400"/>
+        <w:gridCol w:w="5260"/>
+      </w:tblGrid>
+      <w:tr>
+        <w:tc>
+          <w:tcPr>
+            <w:tcW w:w="1400" w:type="dxa"/>
+            <w:tcMar>
+              <w:top w:w="60" w:type="dxa"/>
+              <w:left w:w="100" w:type="dxa"/>
+              <w:bottom w:w="60" w:type="dxa"/>
+              <w:right w:w="100" w:type="dxa"/>
+            </w:tcMar>
+            <w:vAlign w:val="center"/>
+          </w:tcPr>
+          <w:p>
+            <w:pPr/>
+            <w:r>
+              <w:rPr>
+                <w:sz w:val="20"/>
+                <w:szCs w:val="20"/>
+                <w:b/>
+              </w:rPr>
+              <w:t xml:space="preserve">Photograph</w:t>
+            </w:r>
+          </w:p>
+        </w:tc>
+        <w:tc>
+          <w:tcPr>
+            <w:tcW w:w="2400" w:type="dxa"/>
+            <w:tcMar>
+              <w:top w:w="60" w:type="dxa"/>
+              <w:left w:w="100" w:type="dxa"/>
+              <w:bottom w:w="60" w:type="dxa"/>
+              <w:right w:w="100" w:type="dxa"/>
+            </w:tcMar>
+            <w:vAlign w:val="center"/>
+          </w:tcPr>
+          <w:p>
+            <w:pPr/>
+            <w:r>
+              <w:rPr>
+                <w:sz w:val="20"/>
+                <w:szCs w:val="20"/>
+                <w:b/>
+              </w:rPr>
+              <w:t xml:space="preserve">Component</w:t>
+            </w:r>
+          </w:p>
+        </w:tc>
+        <w:tc>
+          <w:tcPr>
+            <w:tcW w:w="5260" w:type="dxa"/>
+            <w:tcMar>
+              <w:top w:w="60" w:type="dxa"/>
+              <w:left w:w="100" w:type="dxa"/>
+              <w:bottom w:w="60" w:type="dxa"/>
+              <w:right w:w="100" w:type="dxa"/>
+            </w:tcMar>
+            <w:vAlign w:val="center"/>
+          </w:tcPr>
+          <w:p>
+            <w:pPr/>
+            <w:r>
+              <w:rPr>
+                <w:sz w:val="20"/>
+                <w:szCs w:val="20"/>
+                <w:b/>
+              </w:rPr>
+              <w:t xml:space="preserve">Notes</w:t>
+            </w:r>
+          </w:p>
+        </w:tc>
+      </w:tr>
+      <w:tr>
+        <w:tc>
+          <w:tcPr>
+            <w:tcW w:w="1400" w:type="dxa"/>
+            <w:tcMar>
+              <w:top w:w="60" w:type="dxa"/>
+              <w:left w:w="100" w:type="dxa"/>
+              <w:bottom w:w="60" w:type="dxa"/>
+              <w:right w:w="100" w:type="dxa"/>
+            </w:tcMar>
+            <w:vAlign w:val="center"/>
+          </w:tcPr>
+          <w:p>
+            <w:pPr>
+              <w:jc w:val="center"/>
+            </w:pPr>
+            <w:r>
+              <w:rPr>
+                <w:noProof/>
+              </w:rPr>
+              <w:drawing>
+                <wp:inline distT="0" distB="0" distL="0" distR="0">
+                  <wp:extent cx="850000" cy="850000"/>
+                  <wp:effectExtent l="0" t="0" r="0" b="0"/>
+                  <wp:docPr id="6000001" name="Arduino Uno R4 (Minima/WiFi)"/>
+                  <wp:cNvGraphicFramePr>
+                    <a:graphicFrameLocks xmlns:a="http://schemas.openxmlformats.org/drawingml/2006/main" noChangeAspect="1"/>
+                  </wp:cNvGraphicFramePr>
+                  <a:graphic xmlns:a="http://schemas.openxmlformats.org/drawingml/2006/main">
+                    <a:graphicData uri="http://schemas.openxmlformats.org/drawingml/2006/picture">
+                      <pic:pic xmlns:pic="http://schemas.openxmlformats.org/drawingml/2006/picture">
+                        <pic:nvPicPr>
+                          <pic:cNvPr id="0" name=""/>
+                          <pic:cNvPicPr>
+                            <a:picLocks noChangeAspect="1" noChangeArrowheads="1"/>
+                          </pic:cNvPicPr>
+                        </pic:nvPicPr>
+                        <pic:blipFill>
+                          <a:blip r:embed="rId35"/>
+                          <a:stretch>
+                            <a:fillRect/>
+                          </a:stretch>
+                        </pic:blipFill>
+                        <pic:spPr bwMode="auto">
+                          <a:xfrm>
+                            <a:off x="0" y="0"/>
+                            <a:ext cx="850000" cy="850000"/>
+                          </a:xfrm>
+                          <a:prstGeom prst="rect">
+                            <a:avLst/>
+                          </a:prstGeom>
+                        </pic:spPr>
+                      </pic:pic>
+                    </a:graphicData>
+                  </a:graphic>
+                </wp:inline>
+              </w:drawing>
+            </w:r>
+          </w:p>
+        </w:tc>
+        <w:tc>
+          <w:tcPr>
+            <w:tcW w:w="2400" w:type="dxa"/>
+            <w:tcMar>
+              <w:top w:w="60" w:type="dxa"/>
+              <w:left w:w="100" w:type="dxa"/>
+              <w:bottom w:w="60" w:type="dxa"/>
+              <w:right w:w="100" w:type="dxa"/>
+            </w:tcMar>
+            <w:vAlign w:val="center"/>
+          </w:tcPr>
+          <w:p>
+            <w:pPr/>
+            <w:r>
+              <w:rPr>
+                <w:sz w:val="20"/>
+                <w:szCs w:val="20"/>
+              </w:rPr>
+              <w:t xml:space="preserve">Arduino Uno R4 (Minima/WiFi)</w:t>
+            </w:r>
+          </w:p>
+        </w:tc>
+        <w:tc>
+          <w:tcPr>
+            <w:tcW w:w="5260" w:type="dxa"/>
+            <w:tcMar>
+              <w:top w:w="60" w:type="dxa"/>
+              <w:left w:w="100" w:type="dxa"/>
+              <w:bottom w:w="60" w:type="dxa"/>
+              <w:right w:w="100" w:type="dxa"/>
+            </w:tcMar>
+            <w:vAlign w:val="center"/>
+          </w:tcPr>
+          <w:p>
+            <w:pPr/>
+            <w:r>
+              <w:rPr>
+                <w:sz w:val="20"/>
+                <w:szCs w:val="20"/>
+              </w:rPr>
+              <w:t xml:space="preserve">Central microcontroller. Runs the navigation, dispensing, and watering control loop and posts telemetry over Wi-Fi.</w:t>
+            </w:r>
+          </w:p>
+        </w:tc>
+      </w:tr>
+      <w:tr>
+        <w:tc>
+          <w:tcPr>
+            <w:tcW w:w="1400" w:type="dxa"/>
+            <w:tcMar>
+              <w:top w:w="60" w:type="dxa"/>
+              <w:left w:w="100" w:type="dxa"/>
+              <w:bottom w:w="60" w:type="dxa"/>
+              <w:right w:w="100" w:type="dxa"/>
+            </w:tcMar>
+            <w:vAlign w:val="center"/>
+          </w:tcPr>
+          <w:p>
+            <w:pPr>
+              <w:jc w:val="center"/>
+            </w:pPr>
+            <w:r>
+              <w:rPr>
+                <w:noProof/>
+              </w:rPr>
+              <w:drawing>
+                <wp:inline distT="0" distB="0" distL="0" distR="0">
+                  <wp:extent cx="850000" cy="850000"/>
+                  <wp:effectExtent l="0" t="0" r="0" b="0"/>
+                  <wp:docPr id="6000002" name="BTS7960 H-bridge motor driver"/>
+                  <wp:cNvGraphicFramePr>
+                    <a:graphicFrameLocks xmlns:a="http://schemas.openxmlformats.org/drawingml/2006/main" noChangeAspect="1"/>
+                  </wp:cNvGraphicFramePr>
+                  <a:graphic xmlns:a="http://schemas.openxmlformats.org/drawingml/2006/main">
+                    <a:graphicData uri="http://schemas.openxmlformats.org/drawingml/2006/picture">
+                      <pic:pic xmlns:pic="http://schemas.openxmlformats.org/drawingml/2006/picture">
+                        <pic:nvPicPr>
+                          <pic:cNvPr id="0" name=""/>
+                          <pic:cNvPicPr>
+                            <a:picLocks noChangeAspect="1" noChangeArrowheads="1"/>
+                          </pic:cNvPicPr>
+                        </pic:nvPicPr>
+                        <pic:blipFill>
+                          <a:blip r:embed="rId36"/>
+                          <a:stretch>
+                            <a:fillRect/>
+                          </a:stretch>
+                        </pic:blipFill>
+                        <pic:spPr bwMode="auto">
+                          <a:xfrm>
+                            <a:off x="0" y="0"/>
+                            <a:ext cx="850000" cy="850000"/>
+                          </a:xfrm>
+                          <a:prstGeom prst="rect">
+                            <a:avLst/>
+                          </a:prstGeom>
+                        </pic:spPr>
+                      </pic:pic>
+                    </a:graphicData>
+                  </a:graphic>
+                </wp:inline>
+              </w:drawing>
+            </w:r>
+          </w:p>
+        </w:tc>
+        <w:tc>
+          <w:tcPr>
+            <w:tcW w:w="2400" w:type="dxa"/>
+            <w:tcMar>
+              <w:top w:w="60" w:type="dxa"/>
+              <w:left w:w="100" w:type="dxa"/>
+              <w:bottom w:w="60" w:type="dxa"/>
+              <w:right w:w="100" w:type="dxa"/>
+            </w:tcMar>
+            <w:vAlign w:val="center"/>
+          </w:tcPr>
+          <w:p>
+            <w:pPr/>
+            <w:r>
+              <w:rPr>
+                <w:sz w:val="20"/>
+                <w:szCs w:val="20"/>
+              </w:rPr>
+              <w:t xml:space="preserve">BTS7960 H-bridge motor driver</w:t>
+            </w:r>
+          </w:p>
+        </w:tc>
+        <w:tc>
+          <w:tcPr>
+            <w:tcW w:w="5260" w:type="dxa"/>
+            <w:tcMar>
+              <w:top w:w="60" w:type="dxa"/>
+              <w:left w:w="100" w:type="dxa"/>
+              <w:bottom w:w="60" w:type="dxa"/>
+              <w:right w:w="100" w:type="dxa"/>
+            </w:tcMar>
+            <w:vAlign w:val="center"/>
+          </w:tcPr>
+          <w:p>
+            <w:pPr/>
+            <w:r>
+              <w:rPr>
+                <w:sz w:val="20"/>
+                <w:szCs w:val="20"/>
+              </w:rPr>
+              <w:t xml:space="preserve">One per side (left and right). Converts the PWM and direction signals from the Arduino into motor drive current.</w:t>
+            </w:r>
+          </w:p>
+        </w:tc>
+      </w:tr>
+      <w:tr>
+        <w:tc>
+          <w:tcPr>
+            <w:tcW w:w="1400" w:type="dxa"/>
+            <w:tcMar>
+              <w:top w:w="60" w:type="dxa"/>
+              <w:left w:w="100" w:type="dxa"/>
+              <w:bottom w:w="60" w:type="dxa"/>
+              <w:right w:w="100" w:type="dxa"/>
+            </w:tcMar>
+            <w:vAlign w:val="center"/>
+          </w:tcPr>
+          <w:p>
+            <w:pPr>
+              <w:jc w:val="center"/>
+            </w:pPr>
+            <w:r>
+              <w:rPr>
+                <w:noProof/>
+              </w:rPr>
+              <w:drawing>
+                <wp:inline distT="0" distB="0" distL="0" distR="0">
+                  <wp:extent cx="850000" cy="850000"/>
+                  <wp:effectExtent l="0" t="0" r="0" b="0"/>
+                  <wp:docPr id="6000003" name="u-blox NEO-M8N GPS module (onboard compass)"/>
+                  <wp:cNvGraphicFramePr>
+                    <a:graphicFrameLocks xmlns:a="http://schemas.openxmlformats.org/drawingml/2006/main" noChangeAspect="1"/>
+                  </wp:cNvGraphicFramePr>
+                  <a:graphic xmlns:a="http://schemas.openxmlformats.org/drawingml/2006/main">
+                    <a:graphicData uri="http://schemas.openxmlformats.org/drawingml/2006/picture">
+                      <pic:pic xmlns:pic="http://schemas.openxmlformats.org/drawingml/2006/picture">
+                        <pic:nvPicPr>
+                          <pic:cNvPr id="0" name=""/>
+                          <pic:cNvPicPr>
+                            <a:picLocks noChangeAspect="1" noChangeArrowheads="1"/>
+                          </pic:cNvPicPr>
+                        </pic:nvPicPr>
+                        <pic:blipFill>
+                          <a:blip r:embed="rId37"/>
+                          <a:stretch>
+                            <a:fillRect/>
+                          </a:stretch>
+                        </pic:blipFill>
+                        <pic:spPr bwMode="auto">
+                          <a:xfrm>
+                            <a:off x="0" y="0"/>
+                            <a:ext cx="850000" cy="850000"/>
+                          </a:xfrm>
+                          <a:prstGeom prst="rect">
+                            <a:avLst/>
+                          </a:prstGeom>
+                        </pic:spPr>
+                      </pic:pic>
+                    </a:graphicData>
+                  </a:graphic>
+                </wp:inline>
+              </w:drawing>
+            </w:r>
+          </w:p>
+        </w:tc>
+        <w:tc>
+          <w:tcPr>
+            <w:tcW w:w="2400" w:type="dxa"/>
+            <w:tcMar>
+              <w:top w:w="60" w:type="dxa"/>
+              <w:left w:w="100" w:type="dxa"/>
+              <w:bottom w:w="60" w:type="dxa"/>
+              <w:right w:w="100" w:type="dxa"/>
+            </w:tcMar>
+            <w:vAlign w:val="center"/>
+          </w:tcPr>
+          <w:p>
+            <w:pPr/>
+            <w:r>
+              <w:rPr>
+                <w:sz w:val="20"/>
+                <w:szCs w:val="20"/>
+              </w:rPr>
+              <w:t xml:space="preserve">u-blox NEO-M8N GPS module (onboard compass)</w:t>
+            </w:r>
+          </w:p>
+        </w:tc>
+        <w:tc>
+          <w:tcPr>
+            <w:tcW w:w="5260" w:type="dxa"/>
+            <w:tcMar>
+              <w:top w:w="60" w:type="dxa"/>
+              <w:left w:w="100" w:type="dxa"/>
+              <w:bottom w:w="60" w:type="dxa"/>
+              <w:right w:w="100" w:type="dxa"/>
+            </w:tcMar>
+            <w:vAlign w:val="center"/>
+          </w:tcPr>
+          <w:p>
+            <w:pPr/>
+            <w:r>
+              <w:rPr>
+                <w:sz w:val="20"/>
+                <w:szCs w:val="20"/>
+              </w:rPr>
+              <w:t xml:space="preserve">Provides position and Doppler speed over UART. The onboard compass supplies the absolute heading reference on the I2C bus, so no separate HMC5883L breakout was fitted.</w:t>
+            </w:r>
+          </w:p>
+        </w:tc>
+      </w:tr>
+      <w:tr>
+        <w:tc>
+          <w:tcPr>
+            <w:tcW w:w="1400" w:type="dxa"/>
+            <w:tcMar>
+              <w:top w:w="60" w:type="dxa"/>
+              <w:left w:w="100" w:type="dxa"/>
+              <w:bottom w:w="60" w:type="dxa"/>
+              <w:right w:w="100" w:type="dxa"/>
+            </w:tcMar>
+            <w:vAlign w:val="center"/>
+          </w:tcPr>
+          <w:p>
+            <w:pPr>
+              <w:jc w:val="center"/>
+            </w:pPr>
+            <w:r>
+              <w:rPr>
+                <w:noProof/>
+              </w:rPr>
+              <w:drawing>
+                <wp:inline distT="0" distB="0" distL="0" distR="0">
+                  <wp:extent cx="850000" cy="727532"/>
+                  <wp:effectExtent l="0" t="0" r="0" b="0"/>
+                  <wp:docPr id="6000004" name="MPU6050 IMU"/>
+                  <wp:cNvGraphicFramePr>
+                    <a:graphicFrameLocks xmlns:a="http://schemas.openxmlformats.org/drawingml/2006/main" noChangeAspect="1"/>
+                  </wp:cNvGraphicFramePr>
+                  <a:graphic xmlns:a="http://schemas.openxmlformats.org/drawingml/2006/main">
+                    <a:graphicData uri="http://schemas.openxmlformats.org/drawingml/2006/picture">
+                      <pic:pic xmlns:pic="http://schemas.openxmlformats.org/drawingml/2006/picture">
+                        <pic:nvPicPr>
+                          <pic:cNvPr id="0" name=""/>
+                          <pic:cNvPicPr>
+                            <a:picLocks noChangeAspect="1" noChangeArrowheads="1"/>
+                          </pic:cNvPicPr>
+                        </pic:nvPicPr>
+                        <pic:blipFill>
+                          <a:blip r:embed="rId38"/>
+                          <a:stretch>
+                            <a:fillRect/>
+                          </a:stretch>
+                        </pic:blipFill>
+                        <pic:spPr bwMode="auto">
+                          <a:xfrm>
+                            <a:off x="0" y="0"/>
+                            <a:ext cx="850000" cy="727532"/>
+                          </a:xfrm>
+                          <a:prstGeom prst="rect">
+                            <a:avLst/>
+                          </a:prstGeom>
+                        </pic:spPr>
+                      </pic:pic>
+                    </a:graphicData>
+                  </a:graphic>
+                </wp:inline>
+              </w:drawing>
+            </w:r>
+          </w:p>
+        </w:tc>
+        <w:tc>
+          <w:tcPr>
+            <w:tcW w:w="2400" w:type="dxa"/>
+            <w:tcMar>
+              <w:top w:w="60" w:type="dxa"/>
+              <w:left w:w="100" w:type="dxa"/>
+              <w:bottom w:w="60" w:type="dxa"/>
+              <w:right w:w="100" w:type="dxa"/>
+            </w:tcMar>
+            <w:vAlign w:val="center"/>
+          </w:tcPr>
+          <w:p>
+            <w:pPr/>
+            <w:r>
+              <w:rPr>
+                <w:sz w:val="20"/>
+                <w:szCs w:val="20"/>
+              </w:rPr>
+              <w:t xml:space="preserve">MPU6050 IMU</w:t>
+            </w:r>
+          </w:p>
+        </w:tc>
+        <w:tc>
+          <w:tcPr>
+            <w:tcW w:w="5260" w:type="dxa"/>
+            <w:tcMar>
+              <w:top w:w="60" w:type="dxa"/>
+              <w:left w:w="100" w:type="dxa"/>
+              <w:bottom w:w="60" w:type="dxa"/>
+              <w:right w:w="100" w:type="dxa"/>
+            </w:tcMar>
+            <w:vAlign w:val="center"/>
+          </w:tcPr>
+          <w:p>
+            <w:pPr/>
+            <w:r>
+              <w:rPr>
+                <w:sz w:val="20"/>
+                <w:szCs w:val="20"/>
+              </w:rPr>
+              <w:t xml:space="preserve">Six-axis accelerometer and gyroscope. Its short-term rotation rate feeds the complementary heading filter and the pitch/roll estimate.</w:t>
+            </w:r>
+          </w:p>
+        </w:tc>
+      </w:tr>
+      <w:tr>
+        <w:tc>
+          <w:tcPr>
+            <w:tcW w:w="1400" w:type="dxa"/>
+            <w:tcMar>
+              <w:top w:w="60" w:type="dxa"/>
+              <w:left w:w="100" w:type="dxa"/>
+              <w:bottom w:w="60" w:type="dxa"/>
+              <w:right w:w="100" w:type="dxa"/>
+            </w:tcMar>
+            <w:vAlign w:val="center"/>
+          </w:tcPr>
+          <w:p>
+            <w:pPr>
+              <w:jc w:val="center"/>
+            </w:pPr>
+            <w:r>
+              <w:rPr>
+                <w:noProof/>
+              </w:rPr>
+              <w:drawing>
+                <wp:inline distT="0" distB="0" distL="0" distR="0">
+                  <wp:extent cx="850000" cy="784081"/>
+                  <wp:effectExtent l="0" t="0" r="0" b="0"/>
+                  <wp:docPr id="6000005" name="BME280 environmental sensor"/>
+                  <wp:cNvGraphicFramePr>
+                    <a:graphicFrameLocks xmlns:a="http://schemas.openxmlformats.org/drawingml/2006/main" noChangeAspect="1"/>
+                  </wp:cNvGraphicFramePr>
+                  <a:graphic xmlns:a="http://schemas.openxmlformats.org/drawingml/2006/main">
+                    <a:graphicData uri="http://schemas.openxmlformats.org/drawingml/2006/picture">
+                      <pic:pic xmlns:pic="http://schemas.openxmlformats.org/drawingml/2006/picture">
+                        <pic:nvPicPr>
+                          <pic:cNvPr id="0" name=""/>
+                          <pic:cNvPicPr>
+                            <a:picLocks noChangeAspect="1" noChangeArrowheads="1"/>
+                          </pic:cNvPicPr>
+                        </pic:nvPicPr>
+                        <pic:blipFill>
+                          <a:blip r:embed="rId39"/>
+                          <a:stretch>
+                            <a:fillRect/>
+                          </a:stretch>
+                        </pic:blipFill>
+                        <pic:spPr bwMode="auto">
+                          <a:xfrm>
+                            <a:off x="0" y="0"/>
+                            <a:ext cx="850000" cy="784081"/>
+                          </a:xfrm>
+                          <a:prstGeom prst="rect">
+                            <a:avLst/>
+                          </a:prstGeom>
+                        </pic:spPr>
+                      </pic:pic>
+                    </a:graphicData>
+                  </a:graphic>
+                </wp:inline>
+              </w:drawing>
+            </w:r>
+          </w:p>
+        </w:tc>
+        <w:tc>
+          <w:tcPr>
+            <w:tcW w:w="2400" w:type="dxa"/>
+            <w:tcMar>
+              <w:top w:w="60" w:type="dxa"/>
+              <w:left w:w="100" w:type="dxa"/>
+              <w:bottom w:w="60" w:type="dxa"/>
+              <w:right w:w="100" w:type="dxa"/>
+            </w:tcMar>
+            <w:vAlign w:val="center"/>
+          </w:tcPr>
+          <w:p>
+            <w:pPr/>
+            <w:r>
+              <w:rPr>
+                <w:sz w:val="20"/>
+                <w:szCs w:val="20"/>
+              </w:rPr>
+              <w:t xml:space="preserve">BME280 environmental sensor</w:t>
+            </w:r>
+          </w:p>
+        </w:tc>
+        <w:tc>
+          <w:tcPr>
+            <w:tcW w:w="5260" w:type="dxa"/>
+            <w:tcMar>
+              <w:top w:w="60" w:type="dxa"/>
+              <w:left w:w="100" w:type="dxa"/>
+              <w:bottom w:w="60" w:type="dxa"/>
+              <w:right w:w="100" w:type="dxa"/>
+            </w:tcMar>
+            <w:vAlign w:val="center"/>
+          </w:tcPr>
+          <w:p>
+            <w:pPr/>
+            <w:r>
+              <w:rPr>
+                <w:sz w:val="20"/>
+                <w:szCs w:val="20"/>
+              </w:rPr>
+              <w:t xml:space="preserve">Temperature, humidity, and pressure. The barometric reading is tared at boot and used for relative elevation logging.</w:t>
+            </w:r>
+          </w:p>
+        </w:tc>
+      </w:tr>
+      <w:tr>
+        <w:tc>
+          <w:tcPr>
+            <w:tcW w:w="1400" w:type="dxa"/>
+            <w:tcMar>
+              <w:top w:w="60" w:type="dxa"/>
+              <w:left w:w="100" w:type="dxa"/>
+              <w:bottom w:w="60" w:type="dxa"/>
+              <w:right w:w="100" w:type="dxa"/>
+            </w:tcMar>
+            <w:vAlign w:val="center"/>
+          </w:tcPr>
+          <w:p>
+            <w:pPr>
+              <w:jc w:val="center"/>
+            </w:pPr>
+            <w:r>
+              <w:rPr>
+                <w:noProof/>
+              </w:rPr>
+              <w:drawing>
+                <wp:inline distT="0" distB="0" distL="0" distR="0">
+                  <wp:extent cx="850000" cy="850000"/>
+                  <wp:effectExtent l="0" t="0" r="0" b="0"/>
+                  <wp:docPr id="6000006" name="5V single-channel relay module"/>
+                  <wp:cNvGraphicFramePr>
+                    <a:graphicFrameLocks xmlns:a="http://schemas.openxmlformats.org/drawingml/2006/main" noChangeAspect="1"/>
+                  </wp:cNvGraphicFramePr>
+                  <a:graphic xmlns:a="http://schemas.openxmlformats.org/drawingml/2006/main">
+                    <a:graphicData uri="http://schemas.openxmlformats.org/drawingml/2006/picture">
+                      <pic:pic xmlns:pic="http://schemas.openxmlformats.org/drawingml/2006/picture">
+                        <pic:nvPicPr>
+                          <pic:cNvPr id="0" name=""/>
+                          <pic:cNvPicPr>
+                            <a:picLocks noChangeAspect="1" noChangeArrowheads="1"/>
+                          </pic:cNvPicPr>
+                        </pic:nvPicPr>
+                        <pic:blipFill>
+                          <a:blip r:embed="rId40"/>
+                          <a:stretch>
+                            <a:fillRect/>
+                          </a:stretch>
+                        </pic:blipFill>
+                        <pic:spPr bwMode="auto">
+                          <a:xfrm>
+                            <a:off x="0" y="0"/>
+                            <a:ext cx="850000" cy="850000"/>
+                          </a:xfrm>
+                          <a:prstGeom prst="rect">
+                            <a:avLst/>
+                          </a:prstGeom>
+                        </pic:spPr>
+                      </pic:pic>
+                    </a:graphicData>
+                  </a:graphic>
+                </wp:inline>
+              </w:drawing>
+            </w:r>
+          </w:p>
+        </w:tc>
+        <w:tc>
+          <w:tcPr>
+            <w:tcW w:w="2400" w:type="dxa"/>
+            <w:tcMar>
+              <w:top w:w="60" w:type="dxa"/>
+              <w:left w:w="100" w:type="dxa"/>
+              <w:bottom w:w="60" w:type="dxa"/>
+              <w:right w:w="100" w:type="dxa"/>
+            </w:tcMar>
+            <w:vAlign w:val="center"/>
+          </w:tcPr>
+          <w:p>
+            <w:pPr/>
+            <w:r>
+              <w:rPr>
+                <w:sz w:val="20"/>
+                <w:szCs w:val="20"/>
+              </w:rPr>
+              <w:t xml:space="preserve">5V single-channel relay module</w:t>
+            </w:r>
+          </w:p>
+        </w:tc>
+        <w:tc>
+          <w:tcPr>
+            <w:tcW w:w="5260" w:type="dxa"/>
+            <w:tcMar>
+              <w:top w:w="60" w:type="dxa"/>
+              <w:left w:w="100" w:type="dxa"/>
+              <w:bottom w:w="60" w:type="dxa"/>
+              <w:right w:w="100" w:type="dxa"/>
+            </w:tcMar>
+            <w:vAlign w:val="center"/>
+          </w:tcPr>
+          <w:p>
+            <w:pPr/>
+            <w:r>
+              <w:rPr>
+                <w:sz w:val="20"/>
+                <w:szCs w:val="20"/>
+              </w:rPr>
+              <w:t xml:space="preserve">Switches the water pump on and off under firmware control whenever a planting point is found to be dry.</w:t>
+            </w:r>
+          </w:p>
+        </w:tc>
+      </w:tr>
+      <w:tr>
+        <w:tc>
+          <w:tcPr>
+            <w:tcW w:w="1400" w:type="dxa"/>
+            <w:tcMar>
+              <w:top w:w="60" w:type="dxa"/>
+              <w:left w:w="100" w:type="dxa"/>
+              <w:bottom w:w="60" w:type="dxa"/>
+              <w:right w:w="100" w:type="dxa"/>
+            </w:tcMar>
+            <w:vAlign w:val="center"/>
+          </w:tcPr>
+          <w:p>
+            <w:pPr>
+              <w:jc w:val="center"/>
+            </w:pPr>
+            <w:r>
+              <w:rPr>
+                <w:noProof/>
+              </w:rPr>
+              <w:drawing>
+                <wp:inline distT="0" distB="0" distL="0" distR="0">
+                  <wp:extent cx="850000" cy="850000"/>
+                  <wp:effectExtent l="0" t="0" r="0" b="0"/>
+                  <wp:docPr id="6000007" name="Low-voltage DC submersible/diaphragm pump"/>
+                  <wp:cNvGraphicFramePr>
+                    <a:graphicFrameLocks xmlns:a="http://schemas.openxmlformats.org/drawingml/2006/main" noChangeAspect="1"/>
+                  </wp:cNvGraphicFramePr>
+                  <a:graphic xmlns:a="http://schemas.openxmlformats.org/drawingml/2006/main">
+                    <a:graphicData uri="http://schemas.openxmlformats.org/drawingml/2006/picture">
+                      <pic:pic xmlns:pic="http://schemas.openxmlformats.org/drawingml/2006/picture">
+                        <pic:nvPicPr>
+                          <pic:cNvPr id="0" name=""/>
+                          <pic:cNvPicPr>
+                            <a:picLocks noChangeAspect="1" noChangeArrowheads="1"/>
+                          </pic:cNvPicPr>
+                        </pic:nvPicPr>
+                        <pic:blipFill>
+                          <a:blip r:embed="rId41"/>
+                          <a:stretch>
+                            <a:fillRect/>
+                          </a:stretch>
+                        </pic:blipFill>
+                        <pic:spPr bwMode="auto">
+                          <a:xfrm>
+                            <a:off x="0" y="0"/>
+                            <a:ext cx="850000" cy="850000"/>
+                          </a:xfrm>
+                          <a:prstGeom prst="rect">
+                            <a:avLst/>
+                          </a:prstGeom>
+                        </pic:spPr>
+                      </pic:pic>
+                    </a:graphicData>
+                  </a:graphic>
+                </wp:inline>
+              </w:drawing>
+            </w:r>
+          </w:p>
+        </w:tc>
+        <w:tc>
+          <w:tcPr>
+            <w:tcW w:w="2400" w:type="dxa"/>
+            <w:tcMar>
+              <w:top w:w="60" w:type="dxa"/>
+              <w:left w:w="100" w:type="dxa"/>
+              <w:bottom w:w="60" w:type="dxa"/>
+              <w:right w:w="100" w:type="dxa"/>
+            </w:tcMar>
+            <w:vAlign w:val="center"/>
+          </w:tcPr>
+          <w:p>
+            <w:pPr/>
+            <w:r>
+              <w:rPr>
+                <w:sz w:val="20"/>
+                <w:szCs w:val="20"/>
+              </w:rPr>
+              <w:t xml:space="preserve">Low-voltage DC submersible/diaphragm pump</w:t>
+            </w:r>
+          </w:p>
+        </w:tc>
+        <w:tc>
+          <w:tcPr>
+            <w:tcW w:w="5260" w:type="dxa"/>
+            <w:tcMar>
+              <w:top w:w="60" w:type="dxa"/>
+              <w:left w:w="100" w:type="dxa"/>
+              <w:bottom w:w="60" w:type="dxa"/>
+              <w:right w:w="100" w:type="dxa"/>
+            </w:tcMar>
+            <w:vAlign w:val="center"/>
+          </w:tcPr>
+          <w:p>
+            <w:pPr/>
+            <w:r>
+              <w:rPr>
+                <w:sz w:val="20"/>
+                <w:szCs w:val="20"/>
+              </w:rPr>
+              <w:t xml:space="preserve">Delivers the metered water dose to a planting point once the relay energises.</w:t>
+            </w:r>
+          </w:p>
+        </w:tc>
+      </w:tr>
+      <w:tr>
+        <w:tc>
+          <w:tcPr>
+            <w:tcW w:w="1400" w:type="dxa"/>
+            <w:tcMar>
+              <w:top w:w="60" w:type="dxa"/>
+              <w:left w:w="100" w:type="dxa"/>
+              <w:bottom w:w="60" w:type="dxa"/>
+              <w:right w:w="100" w:type="dxa"/>
+            </w:tcMar>
+            <w:vAlign w:val="center"/>
+          </w:tcPr>
+          <w:p>
+            <w:pPr>
+              <w:jc w:val="center"/>
+            </w:pPr>
+            <w:r>
+              <w:rPr>
+                <w:noProof/>
+              </w:rPr>
+              <w:drawing>
+                <wp:inline distT="0" distB="0" distL="0" distR="0">
+                  <wp:extent cx="850000" cy="850000"/>
+                  <wp:effectExtent l="0" t="0" r="0" b="0"/>
+                  <wp:docPr id="6000008" name="Capacitive soil moisture sensor"/>
+                  <wp:cNvGraphicFramePr>
+                    <a:graphicFrameLocks xmlns:a="http://schemas.openxmlformats.org/drawingml/2006/main" noChangeAspect="1"/>
+                  </wp:cNvGraphicFramePr>
+                  <a:graphic xmlns:a="http://schemas.openxmlformats.org/drawingml/2006/main">
+                    <a:graphicData uri="http://schemas.openxmlformats.org/drawingml/2006/picture">
+                      <pic:pic xmlns:pic="http://schemas.openxmlformats.org/drawingml/2006/picture">
+                        <pic:nvPicPr>
+                          <pic:cNvPr id="0" name=""/>
+                          <pic:cNvPicPr>
+                            <a:picLocks noChangeAspect="1" noChangeArrowheads="1"/>
+                          </pic:cNvPicPr>
+                        </pic:nvPicPr>
+                        <pic:blipFill>
+                          <a:blip r:embed="rId42"/>
+                          <a:stretch>
+                            <a:fillRect/>
+                          </a:stretch>
+                        </pic:blipFill>
+                        <pic:spPr bwMode="auto">
+                          <a:xfrm>
+                            <a:off x="0" y="0"/>
+                            <a:ext cx="850000" cy="850000"/>
+                          </a:xfrm>
+                          <a:prstGeom prst="rect">
+                            <a:avLst/>
+                          </a:prstGeom>
+                        </pic:spPr>
+                      </pic:pic>
+                    </a:graphicData>
+                  </a:graphic>
+                </wp:inline>
+              </w:drawing>
+            </w:r>
+          </w:p>
+        </w:tc>
+        <w:tc>
+          <w:tcPr>
+            <w:tcW w:w="2400" w:type="dxa"/>
+            <w:tcMar>
+              <w:top w:w="60" w:type="dxa"/>
+              <w:left w:w="100" w:type="dxa"/>
+              <w:bottom w:w="60" w:type="dxa"/>
+              <w:right w:w="100" w:type="dxa"/>
+            </w:tcMar>
+            <w:vAlign w:val="center"/>
+          </w:tcPr>
+          <w:p>
+            <w:pPr/>
+            <w:r>
+              <w:rPr>
+                <w:sz w:val="20"/>
+                <w:szCs w:val="20"/>
+              </w:rPr>
+              <w:t xml:space="preserve">Capacitive soil moisture sensor</w:t>
+            </w:r>
+          </w:p>
+        </w:tc>
+        <w:tc>
+          <w:tcPr>
+            <w:tcW w:w="5260" w:type="dxa"/>
+            <w:tcMar>
+              <w:top w:w="60" w:type="dxa"/>
+              <w:left w:w="100" w:type="dxa"/>
+              <w:bottom w:w="60" w:type="dxa"/>
+              <w:right w:w="100" w:type="dxa"/>
+            </w:tcMar>
+            <w:vAlign w:val="center"/>
+          </w:tcPr>
+          <w:p>
+            <w:pPr/>
+            <w:r>
+              <w:rPr>
+                <w:sz w:val="20"/>
+                <w:szCs w:val="20"/>
+              </w:rPr>
+              <w:t xml:space="preserve">Read on analogue pin A0. Its reading decides whether the pump fires at a given planting point.</w:t>
+            </w:r>
+          </w:p>
+        </w:tc>
+      </w:tr>
+      <w:tr>
+        <w:tc>
+          <w:tcPr>
+            <w:tcW w:w="1400" w:type="dxa"/>
+            <w:tcMar>
+              <w:top w:w="60" w:type="dxa"/>
+              <w:left w:w="100" w:type="dxa"/>
+              <w:bottom w:w="60" w:type="dxa"/>
+              <w:right w:w="100" w:type="dxa"/>
+            </w:tcMar>
+            <w:vAlign w:val="center"/>
+          </w:tcPr>
+          <w:p>
+            <w:pPr>
+              <w:jc w:val="center"/>
+            </w:pPr>
+            <w:r>
+              <w:rPr>
+                <w:noProof/>
+              </w:rPr>
+              <w:drawing>
+                <wp:inline distT="0" distB="0" distL="0" distR="0">
+                  <wp:extent cx="850000" cy="850000"/>
+                  <wp:effectExtent l="0" t="0" r="0" b="0"/>
+                  <wp:docPr id="6000009" name="Standard hobby servo (MG995 or equivalent)"/>
+                  <wp:cNvGraphicFramePr>
+                    <a:graphicFrameLocks xmlns:a="http://schemas.openxmlformats.org/drawingml/2006/main" noChangeAspect="1"/>
+                  </wp:cNvGraphicFramePr>
+                  <a:graphic xmlns:a="http://schemas.openxmlformats.org/drawingml/2006/main">
+                    <a:graphicData uri="http://schemas.openxmlformats.org/drawingml/2006/picture">
+                      <pic:pic xmlns:pic="http://schemas.openxmlformats.org/drawingml/2006/picture">
+                        <pic:nvPicPr>
+                          <pic:cNvPr id="0" name=""/>
+                          <pic:cNvPicPr>
+                            <a:picLocks noChangeAspect="1" noChangeArrowheads="1"/>
+                          </pic:cNvPicPr>
+                        </pic:nvPicPr>
+                        <pic:blipFill>
+                          <a:blip r:embed="rId43"/>
+                          <a:stretch>
+                            <a:fillRect/>
+                          </a:stretch>
+                        </pic:blipFill>
+                        <pic:spPr bwMode="auto">
+                          <a:xfrm>
+                            <a:off x="0" y="0"/>
+                            <a:ext cx="850000" cy="850000"/>
+                          </a:xfrm>
+                          <a:prstGeom prst="rect">
+                            <a:avLst/>
+                          </a:prstGeom>
+                        </pic:spPr>
+                      </pic:pic>
+                    </a:graphicData>
+                  </a:graphic>
+                </wp:inline>
+              </w:drawing>
+            </w:r>
+          </w:p>
+        </w:tc>
+        <w:tc>
+          <w:tcPr>
+            <w:tcW w:w="2400" w:type="dxa"/>
+            <w:tcMar>
+              <w:top w:w="60" w:type="dxa"/>
+              <w:left w:w="100" w:type="dxa"/>
+              <w:bottom w:w="60" w:type="dxa"/>
+              <w:right w:w="100" w:type="dxa"/>
+            </w:tcMar>
+            <w:vAlign w:val="center"/>
+          </w:tcPr>
+          <w:p>
+            <w:pPr/>
+            <w:r>
+              <w:rPr>
+                <w:sz w:val="20"/>
+                <w:szCs w:val="20"/>
+              </w:rPr>
+              <w:t xml:space="preserve">Standard hobby servo (MG995 or equivalent)</w:t>
+            </w:r>
+          </w:p>
+        </w:tc>
+        <w:tc>
+          <w:tcPr>
+            <w:tcW w:w="5260" w:type="dxa"/>
+            <w:tcMar>
+              <w:top w:w="60" w:type="dxa"/>
+              <w:left w:w="100" w:type="dxa"/>
+              <w:bottom w:w="60" w:type="dxa"/>
+              <w:right w:w="100" w:type="dxa"/>
+            </w:tcMar>
+            <w:vAlign w:val="center"/>
+          </w:tcPr>
+          <w:p>
+            <w:pPr/>
+            <w:r>
+              <w:rPr>
+                <w:sz w:val="20"/>
+                <w:szCs w:val="20"/>
+              </w:rPr>
+              <w:t xml:space="preserve">Used twice on the rover, actuating the seed dispenser gate and driving the soil probe arm.</w:t>
+            </w:r>
+          </w:p>
+        </w:tc>
+      </w:tr>
+      <w:tr>
+        <w:tc>
+          <w:tcPr>
+            <w:tcW w:w="1400" w:type="dxa"/>
+            <w:tcMar>
+              <w:top w:w="60" w:type="dxa"/>
+              <w:left w:w="100" w:type="dxa"/>
+              <w:bottom w:w="60" w:type="dxa"/>
+              <w:right w:w="100" w:type="dxa"/>
+            </w:tcMar>
+            <w:vAlign w:val="center"/>
+          </w:tcPr>
+          <w:p>
+            <w:pPr>
+              <w:jc w:val="center"/>
+            </w:pPr>
+            <w:r>
+              <w:rPr>
+                <w:noProof/>
+              </w:rPr>
+              <w:drawing>
+                <wp:inline distT="0" distB="0" distL="0" distR="0">
+                  <wp:extent cx="850000" cy="850000"/>
+                  <wp:effectExtent l="0" t="0" r="0" b="0"/>
+                  <wp:docPr id="6000010" name="JGA25-370 DC gear motor"/>
+                  <wp:cNvGraphicFramePr>
+                    <a:graphicFrameLocks xmlns:a="http://schemas.openxmlformats.org/drawingml/2006/main" noChangeAspect="1"/>
+                  </wp:cNvGraphicFramePr>
+                  <a:graphic xmlns:a="http://schemas.openxmlformats.org/drawingml/2006/main">
+                    <a:graphicData uri="http://schemas.openxmlformats.org/drawingml/2006/picture">
+                      <pic:pic xmlns:pic="http://schemas.openxmlformats.org/drawingml/2006/picture">
+                        <pic:nvPicPr>
+                          <pic:cNvPr id="0" name=""/>
+                          <pic:cNvPicPr>
+                            <a:picLocks noChangeAspect="1" noChangeArrowheads="1"/>
+                          </pic:cNvPicPr>
+                        </pic:nvPicPr>
+                        <pic:blipFill>
+                          <a:blip r:embed="rId44"/>
+                          <a:stretch>
+                            <a:fillRect/>
+                          </a:stretch>
+                        </pic:blipFill>
+                        <pic:spPr bwMode="auto">
+                          <a:xfrm>
+                            <a:off x="0" y="0"/>
+                            <a:ext cx="850000" cy="850000"/>
+                          </a:xfrm>
+                          <a:prstGeom prst="rect">
+                            <a:avLst/>
+                          </a:prstGeom>
+                        </pic:spPr>
+                      </pic:pic>
+                    </a:graphicData>
+                  </a:graphic>
+                </wp:inline>
+              </w:drawing>
+            </w:r>
+          </w:p>
+        </w:tc>
+        <w:tc>
+          <w:tcPr>
+            <w:tcW w:w="2400" w:type="dxa"/>
+            <w:tcMar>
+              <w:top w:w="60" w:type="dxa"/>
+              <w:left w:w="100" w:type="dxa"/>
+              <w:bottom w:w="60" w:type="dxa"/>
+              <w:right w:w="100" w:type="dxa"/>
+            </w:tcMar>
+            <w:vAlign w:val="center"/>
+          </w:tcPr>
+          <w:p>
+            <w:pPr/>
+            <w:r>
+              <w:rPr>
+                <w:sz w:val="20"/>
+                <w:szCs w:val="20"/>
+              </w:rPr>
+              <w:t xml:space="preserve">JGA25-370 DC gear motor</w:t>
+            </w:r>
+          </w:p>
+        </w:tc>
+        <w:tc>
+          <w:tcPr>
+            <w:tcW w:w="5260" w:type="dxa"/>
+            <w:tcMar>
+              <w:top w:w="60" w:type="dxa"/>
+              <w:left w:w="100" w:type="dxa"/>
+              <w:bottom w:w="60" w:type="dxa"/>
+              <w:right w:w="100" w:type="dxa"/>
+            </w:tcMar>
+            <w:vAlign w:val="center"/>
+          </w:tcPr>
+          <w:p>
+            <w:pPr/>
+            <w:r>
+              <w:rPr>
+                <w:sz w:val="20"/>
+                <w:szCs w:val="20"/>
+              </w:rPr>
+              <w:t xml:space="preserve">Four fitted, paired left and right, and driven through the BTS7960 modules for skid-steer locomotion.</w:t>
+            </w:r>
+          </w:p>
+        </w:tc>
+      </w:tr>
+      <w:tr>
+        <w:tc>
+          <w:tcPr>
+            <w:tcW w:w="1400" w:type="dxa"/>
+            <w:tcMar>
+              <w:top w:w="60" w:type="dxa"/>
+              <w:left w:w="100" w:type="dxa"/>
+              <w:bottom w:w="60" w:type="dxa"/>
+              <w:right w:w="100" w:type="dxa"/>
+            </w:tcMar>
+            <w:vAlign w:val="center"/>
+          </w:tcPr>
+          <w:p>
+            <w:pPr>
+              <w:jc w:val="center"/>
+            </w:pPr>
+            <w:r>
+              <w:rPr>
+                <w:noProof/>
+              </w:rPr>
+              <w:drawing>
+                <wp:inline distT="0" distB="0" distL="0" distR="0">
+                  <wp:extent cx="850000" cy="850000"/>
+                  <wp:effectExtent l="0" t="0" r="0" b="0"/>
+                  <wp:docPr id="6000011" name="HC-SR04 ultrasonic sensor"/>
+                  <wp:cNvGraphicFramePr>
+                    <a:graphicFrameLocks xmlns:a="http://schemas.openxmlformats.org/drawingml/2006/main" noChangeAspect="1"/>
+                  </wp:cNvGraphicFramePr>
+                  <a:graphic xmlns:a="http://schemas.openxmlformats.org/drawingml/2006/main">
+                    <a:graphicData uri="http://schemas.openxmlformats.org/drawingml/2006/picture">
+                      <pic:pic xmlns:pic="http://schemas.openxmlformats.org/drawingml/2006/picture">
+                        <pic:nvPicPr>
+                          <pic:cNvPr id="0" name=""/>
+                          <pic:cNvPicPr>
+                            <a:picLocks noChangeAspect="1" noChangeArrowheads="1"/>
+                          </pic:cNvPicPr>
+                        </pic:nvPicPr>
+                        <pic:blipFill>
+                          <a:blip r:embed="rId45"/>
+                          <a:stretch>
+                            <a:fillRect/>
+                          </a:stretch>
+                        </pic:blipFill>
+                        <pic:spPr bwMode="auto">
+                          <a:xfrm>
+                            <a:off x="0" y="0"/>
+                            <a:ext cx="850000" cy="850000"/>
+                          </a:xfrm>
+                          <a:prstGeom prst="rect">
+                            <a:avLst/>
+                          </a:prstGeom>
+                        </pic:spPr>
+                      </pic:pic>
+                    </a:graphicData>
+                  </a:graphic>
+                </wp:inline>
+              </w:drawing>
+            </w:r>
+          </w:p>
+        </w:tc>
+        <w:tc>
+          <w:tcPr>
+            <w:tcW w:w="2400" w:type="dxa"/>
+            <w:tcMar>
+              <w:top w:w="60" w:type="dxa"/>
+              <w:left w:w="100" w:type="dxa"/>
+              <w:bottom w:w="60" w:type="dxa"/>
+              <w:right w:w="100" w:type="dxa"/>
+            </w:tcMar>
+            <w:vAlign w:val="center"/>
+          </w:tcPr>
+          <w:p>
+            <w:pPr/>
+            <w:r>
+              <w:rPr>
+                <w:sz w:val="20"/>
+                <w:szCs w:val="20"/>
+              </w:rPr>
+              <w:t xml:space="preserve">HC-SR04 ultrasonic sensor</w:t>
+            </w:r>
+          </w:p>
+        </w:tc>
+        <w:tc>
+          <w:tcPr>
+            <w:tcW w:w="5260" w:type="dxa"/>
+            <w:tcMar>
+              <w:top w:w="60" w:type="dxa"/>
+              <w:left w:w="100" w:type="dxa"/>
+              <w:bottom w:w="60" w:type="dxa"/>
+              <w:right w:w="100" w:type="dxa"/>
+            </w:tcMar>
+            <w:vAlign w:val="center"/>
+          </w:tcPr>
+          <w:p>
+            <w:pPr/>
+            <w:r>
+              <w:rPr>
+                <w:sz w:val="20"/>
+                <w:szCs w:val="20"/>
+              </w:rPr>
+              <w:t xml:space="preserve">Planned forward obstacle detection. Trigger and echo lines run on two analogue pins used as digital I/O.</w:t>
+            </w:r>
+          </w:p>
+        </w:tc>
+      </w:tr>
+      <w:tr>
+        <w:tc>
+          <w:tcPr>
+            <w:tcW w:w="1400" w:type="dxa"/>
+            <w:tcMar>
+              <w:top w:w="60" w:type="dxa"/>
+              <w:left w:w="100" w:type="dxa"/>
+              <w:bottom w:w="60" w:type="dxa"/>
+              <w:right w:w="100" w:type="dxa"/>
+            </w:tcMar>
+            <w:vAlign w:val="center"/>
+          </w:tcPr>
+          <w:p>
+            <w:pPr>
+              <w:jc w:val="center"/>
+            </w:pPr>
+            <w:r>
+              <w:rPr>
+                <w:noProof/>
+              </w:rPr>
+              <w:drawing>
+                <wp:inline distT="0" distB="0" distL="0" distR="0">
+                  <wp:extent cx="850000" cy="850000"/>
+                  <wp:effectExtent l="0" t="0" r="0" b="0"/>
+                  <wp:docPr id="6000012" name="WS2812B addressable RGB LED strip"/>
+                  <wp:cNvGraphicFramePr>
+                    <a:graphicFrameLocks xmlns:a="http://schemas.openxmlformats.org/drawingml/2006/main" noChangeAspect="1"/>
+                  </wp:cNvGraphicFramePr>
+                  <a:graphic xmlns:a="http://schemas.openxmlformats.org/drawingml/2006/main">
+                    <a:graphicData uri="http://schemas.openxmlformats.org/drawingml/2006/picture">
+                      <pic:pic xmlns:pic="http://schemas.openxmlformats.org/drawingml/2006/picture">
+                        <pic:nvPicPr>
+                          <pic:cNvPr id="0" name=""/>
+                          <pic:cNvPicPr>
+                            <a:picLocks noChangeAspect="1" noChangeArrowheads="1"/>
+                          </pic:cNvPicPr>
+                        </pic:nvPicPr>
+                        <pic:blipFill>
+                          <a:blip r:embed="rId46"/>
+                          <a:stretch>
+                            <a:fillRect/>
+                          </a:stretch>
+                        </pic:blipFill>
+                        <pic:spPr bwMode="auto">
+                          <a:xfrm>
+                            <a:off x="0" y="0"/>
+                            <a:ext cx="850000" cy="850000"/>
+                          </a:xfrm>
+                          <a:prstGeom prst="rect">
+                            <a:avLst/>
+                          </a:prstGeom>
+                        </pic:spPr>
+                      </pic:pic>
+                    </a:graphicData>
+                  </a:graphic>
+                </wp:inline>
+              </w:drawing>
+            </w:r>
+          </w:p>
+        </w:tc>
+        <w:tc>
+          <w:tcPr>
+            <w:tcW w:w="2400" w:type="dxa"/>
+            <w:tcMar>
+              <w:top w:w="60" w:type="dxa"/>
+              <w:left w:w="100" w:type="dxa"/>
+              <w:bottom w:w="60" w:type="dxa"/>
+              <w:right w:w="100" w:type="dxa"/>
+            </w:tcMar>
+            <w:vAlign w:val="center"/>
+          </w:tcPr>
+          <w:p>
+            <w:pPr/>
+            <w:r>
+              <w:rPr>
+                <w:sz w:val="20"/>
+                <w:szCs w:val="20"/>
+              </w:rPr>
+              <w:t xml:space="preserve">WS2812B addressable RGB LED strip</w:t>
+            </w:r>
+          </w:p>
+        </w:tc>
+        <w:tc>
+          <w:tcPr>
+            <w:tcW w:w="5260" w:type="dxa"/>
+            <w:tcMar>
+              <w:top w:w="60" w:type="dxa"/>
+              <w:left w:w="100" w:type="dxa"/>
+              <w:bottom w:w="60" w:type="dxa"/>
+              <w:right w:w="100" w:type="dxa"/>
+            </w:tcMar>
+            <w:vAlign w:val="center"/>
+          </w:tcPr>
+          <w:p>
+            <w:pPr/>
+            <w:r>
+              <w:rPr>
+                <w:sz w:val="20"/>
+                <w:szCs w:val="20"/>
+              </w:rPr>
+              <w:t xml:space="preserve">Planned status indicator, powered separately through a buck converter rather than from the Arduino's 5V rail.</w:t>
+            </w:r>
+          </w:p>
+        </w:tc>
+      </w:tr>
+      <w:tr>
+        <w:tc>
+          <w:tcPr>
+            <w:tcW w:w="1400" w:type="dxa"/>
+            <w:tcMar>
+              <w:top w:w="60" w:type="dxa"/>
+              <w:left w:w="100" w:type="dxa"/>
+              <w:bottom w:w="60" w:type="dxa"/>
+              <w:right w:w="100" w:type="dxa"/>
+            </w:tcMar>
+            <w:vAlign w:val="center"/>
+          </w:tcPr>
+          <w:p>
+            <w:pPr>
+              <w:jc w:val="center"/>
+            </w:pPr>
+            <w:r>
+              <w:rPr>
+                <w:noProof/>
+              </w:rPr>
+              <w:drawing>
+                <wp:inline distT="0" distB="0" distL="0" distR="0">
+                  <wp:extent cx="850000" cy="850000"/>
+                  <wp:effectExtent l="0" t="0" r="0" b="0"/>
+                  <wp:docPr id="6000013" name="LM2596 buck converter"/>
+                  <wp:cNvGraphicFramePr>
+                    <a:graphicFrameLocks xmlns:a="http://schemas.openxmlformats.org/drawingml/2006/main" noChangeAspect="1"/>
+                  </wp:cNvGraphicFramePr>
+                  <a:graphic xmlns:a="http://schemas.openxmlformats.org/drawingml/2006/main">
+                    <a:graphicData uri="http://schemas.openxmlformats.org/drawingml/2006/picture">
+                      <pic:pic xmlns:pic="http://schemas.openxmlformats.org/drawingml/2006/picture">
+                        <pic:nvPicPr>
+                          <pic:cNvPr id="0" name=""/>
+                          <pic:cNvPicPr>
+                            <a:picLocks noChangeAspect="1" noChangeArrowheads="1"/>
+                          </pic:cNvPicPr>
+                        </pic:nvPicPr>
+                        <pic:blipFill>
+                          <a:blip r:embed="rId47"/>
+                          <a:stretch>
+                            <a:fillRect/>
+                          </a:stretch>
+                        </pic:blipFill>
+                        <pic:spPr bwMode="auto">
+                          <a:xfrm>
+                            <a:off x="0" y="0"/>
+                            <a:ext cx="850000" cy="850000"/>
+                          </a:xfrm>
+                          <a:prstGeom prst="rect">
+                            <a:avLst/>
+                          </a:prstGeom>
+                        </pic:spPr>
+                      </pic:pic>
+                    </a:graphicData>
+                  </a:graphic>
+                </wp:inline>
+              </w:drawing>
+            </w:r>
+          </w:p>
+        </w:tc>
+        <w:tc>
+          <w:tcPr>
+            <w:tcW w:w="2400" w:type="dxa"/>
+            <w:tcMar>
+              <w:top w:w="60" w:type="dxa"/>
+              <w:left w:w="100" w:type="dxa"/>
+              <w:bottom w:w="60" w:type="dxa"/>
+              <w:right w:w="100" w:type="dxa"/>
+            </w:tcMar>
+            <w:vAlign w:val="center"/>
+          </w:tcPr>
+          <w:p>
+            <w:pPr/>
+            <w:r>
+              <w:rPr>
+                <w:sz w:val="20"/>
+                <w:szCs w:val="20"/>
+              </w:rPr>
+              <w:t xml:space="preserve">LM2596 buck converter</w:t>
+            </w:r>
+          </w:p>
+        </w:tc>
+        <w:tc>
+          <w:tcPr>
+            <w:tcW w:w="5260" w:type="dxa"/>
+            <w:tcMar>
+              <w:top w:w="60" w:type="dxa"/>
+              <w:left w:w="100" w:type="dxa"/>
+              <w:bottom w:w="60" w:type="dxa"/>
+              <w:right w:w="100" w:type="dxa"/>
+            </w:tcMar>
+            <w:vAlign w:val="center"/>
+          </w:tcPr>
+          <w:p>
+            <w:pPr/>
+            <w:r>
+              <w:rPr>
+                <w:sz w:val="20"/>
+                <w:szCs w:val="20"/>
+              </w:rPr>
+              <w:t xml:space="preserve">Steps the 12V battery rail down to power the WS2812B strip independently of the Arduino's 5V regulator.</w:t>
+            </w:r>
+          </w:p>
+        </w:tc>
+      </w:tr>
+      <w:tr>
+        <w:tc>
+          <w:tcPr>
+            <w:tcW w:w="1400" w:type="dxa"/>
+            <w:tcMar>
+              <w:top w:w="60" w:type="dxa"/>
+              <w:left w:w="100" w:type="dxa"/>
+              <w:bottom w:w="60" w:type="dxa"/>
+              <w:right w:w="100" w:type="dxa"/>
+            </w:tcMar>
+            <w:vAlign w:val="center"/>
+          </w:tcPr>
+          <w:p>
+            <w:pPr>
+              <w:jc w:val="center"/>
+            </w:pPr>
+            <w:r>
+              <w:rPr>
+                <w:noProof/>
+              </w:rPr>
+              <w:drawing>
+                <wp:inline distT="0" distB="0" distL="0" distR="0">
+                  <wp:extent cx="850000" cy="789458"/>
+                  <wp:effectExtent l="0" t="0" r="0" b="0"/>
+                  <wp:docPr id="6000014" name="B25 voltage sensor module (0-25V)"/>
+                  <wp:cNvGraphicFramePr>
+                    <a:graphicFrameLocks xmlns:a="http://schemas.openxmlformats.org/drawingml/2006/main" noChangeAspect="1"/>
+                  </wp:cNvGraphicFramePr>
+                  <a:graphic xmlns:a="http://schemas.openxmlformats.org/drawingml/2006/main">
+                    <a:graphicData uri="http://schemas.openxmlformats.org/drawingml/2006/picture">
+                      <pic:pic xmlns:pic="http://schemas.openxmlformats.org/drawingml/2006/picture">
+                        <pic:nvPicPr>
+                          <pic:cNvPr id="0" name=""/>
+                          <pic:cNvPicPr>
+                            <a:picLocks noChangeAspect="1" noChangeArrowheads="1"/>
+                          </pic:cNvPicPr>
+                        </pic:nvPicPr>
+                        <pic:blipFill>
+                          <a:blip r:embed="rId48"/>
+                          <a:stretch>
+                            <a:fillRect/>
+                          </a:stretch>
+                        </pic:blipFill>
+                        <pic:spPr bwMode="auto">
+                          <a:xfrm>
+                            <a:off x="0" y="0"/>
+                            <a:ext cx="850000" cy="789458"/>
+                          </a:xfrm>
+                          <a:prstGeom prst="rect">
+                            <a:avLst/>
+                          </a:prstGeom>
+                        </pic:spPr>
+                      </pic:pic>
+                    </a:graphicData>
+                  </a:graphic>
+                </wp:inline>
+              </w:drawing>
+            </w:r>
+          </w:p>
+        </w:tc>
+        <w:tc>
+          <w:tcPr>
+            <w:tcW w:w="2400" w:type="dxa"/>
+            <w:tcMar>
+              <w:top w:w="60" w:type="dxa"/>
+              <w:left w:w="100" w:type="dxa"/>
+              <w:bottom w:w="60" w:type="dxa"/>
+              <w:right w:w="100" w:type="dxa"/>
+            </w:tcMar>
+            <w:vAlign w:val="center"/>
+          </w:tcPr>
+          <w:p>
+            <w:pPr/>
+            <w:r>
+              <w:rPr>
+                <w:sz w:val="20"/>
+                <w:szCs w:val="20"/>
+              </w:rPr>
+              <w:t xml:space="preserve">B25 voltage sensor module (0-25V)</w:t>
+            </w:r>
+          </w:p>
+        </w:tc>
+        <w:tc>
+          <w:tcPr>
+            <w:tcW w:w="5260" w:type="dxa"/>
+            <w:tcMar>
+              <w:top w:w="60" w:type="dxa"/>
+              <w:left w:w="100" w:type="dxa"/>
+              <w:bottom w:w="60" w:type="dxa"/>
+              <w:right w:w="100" w:type="dxa"/>
+            </w:tcMar>
+            <w:vAlign w:val="center"/>
+          </w:tcPr>
+          <w:p>
+            <w:pPr/>
+            <w:r>
+              <w:rPr>
+                <w:sz w:val="20"/>
+                <w:szCs w:val="20"/>
+              </w:rPr>
+              <w:t xml:space="preserve">Provides the resistive divider used for battery voltage sensing on analogue pin A1.</w:t>
+            </w:r>
+          </w:p>
+        </w:tc>
+      </w:tr>
+      <w:tr>
+        <w:tc>
+          <w:tcPr>
+            <w:tcW w:w="1400" w:type="dxa"/>
+            <w:tcMar>
+              <w:top w:w="60" w:type="dxa"/>
+              <w:left w:w="100" w:type="dxa"/>
+              <w:bottom w:w="60" w:type="dxa"/>
+              <w:right w:w="100" w:type="dxa"/>
+            </w:tcMar>
+            <w:vAlign w:val="center"/>
+          </w:tcPr>
+          <w:p>
+            <w:pPr>
+              <w:jc w:val="center"/>
+            </w:pPr>
+            <w:r>
+              <w:rPr>
+                <w:noProof/>
+              </w:rPr>
+              <w:drawing>
+                <wp:inline distT="0" distB="0" distL="0" distR="0">
+                  <wp:extent cx="850000" cy="850000"/>
+                  <wp:effectExtent l="0" t="0" r="0" b="0"/>
+                  <wp:docPr id="6000015" name="Illuminated rocker switch"/>
+                  <wp:cNvGraphicFramePr>
+                    <a:graphicFrameLocks xmlns:a="http://schemas.openxmlformats.org/drawingml/2006/main" noChangeAspect="1"/>
+                  </wp:cNvGraphicFramePr>
+                  <a:graphic xmlns:a="http://schemas.openxmlformats.org/drawingml/2006/main">
+                    <a:graphicData uri="http://schemas.openxmlformats.org/drawingml/2006/picture">
+                      <pic:pic xmlns:pic="http://schemas.openxmlformats.org/drawingml/2006/picture">
+                        <pic:nvPicPr>
+                          <pic:cNvPr id="0" name=""/>
+                          <pic:cNvPicPr>
+                            <a:picLocks noChangeAspect="1" noChangeArrowheads="1"/>
+                          </pic:cNvPicPr>
+                        </pic:nvPicPr>
+                        <pic:blipFill>
+                          <a:blip r:embed="rId49"/>
+                          <a:stretch>
+                            <a:fillRect/>
+                          </a:stretch>
+                        </pic:blipFill>
+                        <pic:spPr bwMode="auto">
+                          <a:xfrm>
+                            <a:off x="0" y="0"/>
+                            <a:ext cx="850000" cy="850000"/>
+                          </a:xfrm>
+                          <a:prstGeom prst="rect">
+                            <a:avLst/>
+                          </a:prstGeom>
+                        </pic:spPr>
+                      </pic:pic>
+                    </a:graphicData>
+                  </a:graphic>
+                </wp:inline>
+              </w:drawing>
+            </w:r>
+          </w:p>
+        </w:tc>
+        <w:tc>
+          <w:tcPr>
+            <w:tcW w:w="2400" w:type="dxa"/>
+            <w:tcMar>
+              <w:top w:w="60" w:type="dxa"/>
+              <w:left w:w="100" w:type="dxa"/>
+              <w:bottom w:w="60" w:type="dxa"/>
+              <w:right w:w="100" w:type="dxa"/>
+            </w:tcMar>
+            <w:vAlign w:val="center"/>
+          </w:tcPr>
+          <w:p>
+            <w:pPr/>
+            <w:r>
+              <w:rPr>
+                <w:sz w:val="20"/>
+                <w:szCs w:val="20"/>
+              </w:rPr>
+              <w:t xml:space="preserve">Illuminated rocker switch</w:t>
+            </w:r>
+          </w:p>
+        </w:tc>
+        <w:tc>
+          <w:tcPr>
+            <w:tcW w:w="5260" w:type="dxa"/>
+            <w:tcMar>
+              <w:top w:w="60" w:type="dxa"/>
+              <w:left w:w="100" w:type="dxa"/>
+              <w:bottom w:w="60" w:type="dxa"/>
+              <w:right w:w="100" w:type="dxa"/>
+            </w:tcMar>
+            <w:vAlign w:val="center"/>
+          </w:tcPr>
+          <w:p>
+            <w:pPr/>
+            <w:r>
+              <w:rPr>
+                <w:sz w:val="20"/>
+                <w:szCs w:val="20"/>
+              </w:rPr>
+              <w:t xml:space="preserve">Panel-mounted master power switch for the battery circuit, added during assembly.</w:t>
+            </w:r>
+          </w:p>
+        </w:tc>
+      </w:tr>
+    </w:tbl>
+    <w:p>
+      <w:pPr>
+        <w:pStyle w:val="Caption"/>
+        <w:jc w:val="center"/>
+      </w:pPr>
+      <w:bookmarkStart w:id="8950" w:name="_Toc9100001"/>
+      <w:r>
+        <w:t xml:space="preserve">Table 3. </w:t>
+      </w:r>
+      <w:fldSimple w:instr=" SEQ Table_3. \* ARABIC ">
+        <w:r>
+          <w:rPr>
+            <w:noProof/>
+          </w:rPr>
+          <w:t>1</w:t>
+        </w:r>
+      </w:fldSimple>
+      <w:r>
+        <w:t xml:space="preserve">Photographic reference of key electronics components</w:t>
+      </w:r>
+      <w:bookmarkEnd w:id="8950"/>
     </w:p>
     <w:p>
       <w:pPr>

</xml_diff>

<commit_message>
Add software architecture diagram as new Figure 3.4
Inserts the Eraser-generated dual-mode software architecture diagram
at the start of Section 3.8, showing the ROS 2 development/simulation
tier, the standalone Arduino firmware tier, and the cloud/companion
app tier. Since this figure lands before the four companion-app
screenshots added earlier in this section, those are renumbered from
Figures 3.4-3.7 to 3.5-3.8 in the two places that reference them by
number.
</commit_message>
<xml_diff>
--- a/docs/thesis/DESIGN_AND_GHANA_Final.docx
+++ b/docs/thesis/DESIGN_AND_GHANA_Final.docx
@@ -10325,7 +10325,7 @@
         <w:jc w:val="both"/>
       </w:pPr>
       <w:r>
-        <w:t xml:space="preserve">Telemetry follows a cloud-first design rather than logging to an onboard SD card or streaming over a wired serial connection to a laptop. An SD card module was considered but ruled out because of pin contention with the sensors and actuators already occupying most of the Arduino's available pins. Instead, the rover posts location, orientation, environmental, and actuator-state data over WiFi to a cloud-hosted API and database at regular intervals during a run. A browser-based companion application then pulls this data from the API and renders it using Plotly.js, giving the operator a way to review a run's telemetry from any device with a browser, without needing the rover physically connected or a specific desktop application installed. A browser-based Mission Planner has since been added to the companion application. It lets an operator set the row count, drop spacing, and PID gains for a planting run and draws the resulting boustrophedon path before a mission is sent to the rover. A separate Mission Hub page pulls completed runs from the cloud database and renders each one as an interactive three-dimensional terrain model, reconstructed from the barometric elevation readings, alongside the Plotly charts described above. Figures 3.4 to 3.7 show these screens as implemented, using a sample run generated by the application's own demo feature to illustrate the interface rather than field data collected from the physical rover.</w:t>
+        <w:t xml:space="preserve">Telemetry follows a cloud-first design rather than logging to an onboard SD card or streaming over a wired serial connection to a laptop. An SD card module was considered but ruled out because of pin contention with the sensors and actuators already occupying most of the Arduino's available pins. Instead, the rover posts location, orientation, environmental, and actuator-state data over WiFi to a cloud-hosted API and database at regular intervals during a run. A browser-based companion application then pulls this data from the API and renders it using Plotly.js, giving the operator a way to review a run's telemetry from any device with a browser, without needing the rover physically connected or a specific desktop application installed. A browser-based Mission Planner has since been added to the companion application. It lets an operator set the row count, drop spacing, and PID gains for a planting run and draws the resulting boustrophedon path before a mission is sent to the rover. A separate Mission Hub page pulls completed runs from the cloud database and renders each one as an interactive three-dimensional terrain model, reconstructed from the barometric elevation readings, alongside the Plotly charts described above. Figures 3.5 to 3.8 show these screens as implemented, using a sample run generated by the application's own demo feature to illustrate the interface rather than field data collected from the physical rover.</w:t>
       </w:r>
     </w:p>
     <w:p>
@@ -15830,32 +15830,93 @@
     </w:p>
     <w:p>
       <w:pPr>
-        <w:pStyle w:val="Heading3"/>
-      </w:pPr>
-      <w:bookmarkStart w:id="96" w:name="_Toc3000023"/>
-      <w:r>
-        <w:t>3.8.1 Dual-Mode Development Approach</w:t>
-      </w:r>
-      <w:bookmarkEnd w:id="96"/>
-    </w:p>
-    <w:p>
-      <w:pPr>
         <w:spacing w:after="200" w:line="360" w:lineRule="auto"/>
         <w:jc w:val="both"/>
       </w:pPr>
       <w:r>
-        <w:t xml:space="preserve">As identified in Chapter Two, ROS 2 offers strong simulation and development tooling but is not well suited to running directly on a low-cost rover operating in the field, where a software crash or a lost connection to a supervising computer should not be able to strand the machine. This project resolves that tension with a dual-mode approach. Navigation and control algorithms are first designed and tested as ROS 2 nodes, using ROS 2 Jazzy with the Gazebo Harmonic simulator to model the rover's kinematics, sensors, and the field environment before any hardware is involved. Once an algorithm behaves correctly in simulation, its logic is reimplemented in C++ as embedded firmware for the Arduino Uno R4. ROS 2 is therefore a development and simulation tool only; it is never deployed on the rover itself, and the rover does not require a laptop, a stable WiFi connection to a supervising computer, or ROS 2 running anywhere to complete an autonomous mission in the field.</w:t>
-      </w:r>
+        <w:t xml:space="preserve">Figure 3.4 gives an overview of the software architecture described in this section, showing how the ROS 2 development and simulation tier, the standalone Arduino firmware, and the cloud and companion application tier connect to one another. The sections that follow describe each tier in turn.</w:t>
+      </w:r>
+    </w:p>
+    <w:p>
+      <w:pPr>
+        <w:keepNext/>
+        <w:spacing w:before="200"/>
+        <w:jc w:val="center"/>
+      </w:pPr>
+      <w:r>
+        <w:rPr>
+          <w:noProof/>
+        </w:rPr>
+        <w:drawing>
+          <wp:inline distT="0" distB="0" distL="0" distR="0">
+            <wp:extent cx="5100000" cy="4710910"/>
+            <wp:effectExtent l="0" t="0" r="0" b="0"/>
+            <wp:docPr id="7000001" name="Dual-Mode Rover Software Architecture"/>
+            <wp:cNvGraphicFramePr>
+              <a:graphicFrameLocks xmlns:a="http://schemas.openxmlformats.org/drawingml/2006/main" noChangeAspect="1"/>
+            </wp:cNvGraphicFramePr>
+            <a:graphic xmlns:a="http://schemas.openxmlformats.org/drawingml/2006/main">
+              <a:graphicData uri="http://schemas.openxmlformats.org/drawingml/2006/picture">
+                <pic:pic xmlns:pic="http://schemas.openxmlformats.org/drawingml/2006/picture">
+                  <pic:nvPicPr>
+                    <pic:cNvPr id="0" name=""/>
+                    <pic:cNvPicPr>
+                      <a:picLocks noChangeAspect="1" noChangeArrowheads="1"/>
+                    </pic:cNvPicPr>
+                  </pic:nvPicPr>
+                  <pic:blipFill>
+                    <a:blip r:embed="rId50"/>
+                    <a:stretch>
+                      <a:fillRect/>
+                    </a:stretch>
+                  </pic:blipFill>
+                  <pic:spPr bwMode="auto">
+                    <a:xfrm>
+                      <a:off x="0" y="0"/>
+                      <a:ext cx="5100000" cy="4710910"/>
+                    </a:xfrm>
+                    <a:prstGeom prst="rect">
+                      <a:avLst/>
+                    </a:prstGeom>
+                  </pic:spPr>
+                </pic:pic>
+              </a:graphicData>
+            </a:graphic>
+          </wp:inline>
+        </w:drawing>
+      </w:r>
+    </w:p>
+    <w:p>
+      <w:pPr>
+        <w:pStyle w:val="Caption"/>
+        <w:jc w:val="center"/>
+      </w:pPr>
+      <w:bookmarkStart w:id="9200" w:name="_Toc9200001"/>
+      <w:r>
+        <w:t xml:space="preserve">Figure 3. </w:t>
+      </w:r>
+      <w:fldSimple w:instr=" SEQ Figure_3. \* ARABIC ">
+        <w:r>
+          <w:rPr>
+            <w:noProof/>
+          </w:rPr>
+          <w:t>1</w:t>
+        </w:r>
+      </w:fldSimple>
+      <w:r>
+        <w:t xml:space="preserve"> Dual-mode software architecture, from ROS 2 simulation through to embedded firmware and the cloud-connected companion application</w:t>
+      </w:r>
+      <w:bookmarkEnd w:id="9200"/>
     </w:p>
     <w:p>
       <w:pPr>
         <w:pStyle w:val="Heading3"/>
       </w:pPr>
-      <w:bookmarkStart w:id="97" w:name="_Toc3000024"/>
-      <w:r>
-        <w:t>3.8.2 Navigation and Control Algorithm</w:t>
-      </w:r>
-      <w:bookmarkEnd w:id="97"/>
+      <w:bookmarkStart w:id="96" w:name="_Toc3000023"/>
+      <w:r>
+        <w:t>3.8.1 Dual-Mode Development Approach</w:t>
+      </w:r>
+      <w:bookmarkEnd w:id="96"/>
     </w:p>
     <w:p>
       <w:pPr>
@@ -15863,18 +15924,18 @@
         <w:jc w:val="both"/>
       </w:pPr>
       <w:r>
-        <w:t xml:space="preserve">The control loop reads the GPS, IMU, and compass at a fixed interval, updates the complementary-filter heading estimate, and feeds the difference between the current and target heading into a PID controller that adjusts the left and right motor PWM duty cycles to steer the rover back onto its target bearing. Forward progress along a row is tracked by combining the GPS-derived speed with elapsed time, since position fixes alone are not precise enough to reliably confirm short-distance progress between adjacent planting points. When the rover's estimated position falls within the latitude and longitude corridor defined for the current row and the dead-reckoned distance indicates it has reached the next planting interval, the rover stops, actuates the soil probe and seed dispenser in sequence, checks the moisture reading, waters if required, and then resumes travel.</w:t>
+        <w:t xml:space="preserve">As identified in Chapter Two, ROS 2 offers strong simulation and development tooling but is not well suited to running directly on a low-cost rover operating in the field, where a software crash or a lost connection to a supervising computer should not be able to strand the machine. This project resolves that tension with a dual-mode approach. Navigation and control algorithms are first designed and tested as ROS 2 nodes, using ROS 2 Jazzy with the Gazebo Harmonic simulator to model the rover's kinematics, sensors, and the field environment before any hardware is involved. Once an algorithm behaves correctly in simulation, its logic is reimplemented in C++ as embedded firmware for the Arduino Uno R4. ROS 2 is therefore a development and simulation tool only; it is never deployed on the rover itself, and the rover does not require a laptop, a stable WiFi connection to a supervising computer, or ROS 2 running anywhere to complete an autonomous mission in the field.</w:t>
       </w:r>
     </w:p>
     <w:p>
       <w:pPr>
         <w:pStyle w:val="Heading3"/>
       </w:pPr>
-      <w:bookmarkStart w:id="98" w:name="_Toc3000025"/>
-      <w:r>
-        <w:t>3.8.3 Mission Modes and Safety Interlocks</w:t>
-      </w:r>
-      <w:bookmarkEnd w:id="98"/>
+      <w:bookmarkStart w:id="97" w:name="_Toc3000024"/>
+      <w:r>
+        <w:t>3.8.2 Navigation and Control Algorithm</w:t>
+      </w:r>
+      <w:bookmarkEnd w:id="97"/>
     </w:p>
     <w:p>
       <w:pPr>
@@ -15882,18 +15943,18 @@
         <w:jc w:val="both"/>
       </w:pPr>
       <w:r>
-        <w:t xml:space="preserve">The rover supports two modes of operation. In autonomous mission mode, it executes the row-following and planting sequence described above without operator intervention. In manual teleoperation mode, an operator can drive the rover directly and trigger individual actuators, such as a single seed drop or a single watering pulse, without starting a full mission, which is useful for testing and calibration. Both modes share the same underlying safety interlocks: a remote emergency stop that immediately cuts motor power regardless of mode, and a deadman timeout that halts the rover automatically if it stops receiving supervisory input for longer than a set interval during teleoperation.</w:t>
+        <w:t xml:space="preserve">The control loop reads the GPS, IMU, and compass at a fixed interval, updates the complementary-filter heading estimate, and feeds the difference between the current and target heading into a PID controller that adjusts the left and right motor PWM duty cycles to steer the rover back onto its target bearing. Forward progress along a row is tracked by combining the GPS-derived speed with elapsed time, since position fixes alone are not precise enough to reliably confirm short-distance progress between adjacent planting points. When the rover's estimated position falls within the latitude and longitude corridor defined for the current row and the dead-reckoned distance indicates it has reached the next planting interval, the rover stops, actuates the soil probe and seed dispenser in sequence, checks the moisture reading, waters if required, and then resumes travel.</w:t>
       </w:r>
     </w:p>
     <w:p>
       <w:pPr>
         <w:pStyle w:val="Heading3"/>
       </w:pPr>
-      <w:bookmarkStart w:id="99" w:name="_Toc3000026"/>
-      <w:r>
-        <w:t>3.8.4 Telemetry Data Flow</w:t>
-      </w:r>
-      <w:bookmarkEnd w:id="99"/>
+      <w:bookmarkStart w:id="98" w:name="_Toc3000025"/>
+      <w:r>
+        <w:t>3.8.3 Mission Modes and Safety Interlocks</w:t>
+      </w:r>
+      <w:bookmarkEnd w:id="98"/>
     </w:p>
     <w:p>
       <w:pPr>
@@ -15901,8 +15962,18 @@
         <w:jc w:val="both"/>
       </w:pPr>
       <w:r>
-        <w:t xml:space="preserve">During a run, the rover periodically packages its current location, orientation, environmental readings, and actuator states and sends them over WiFi as an HTTP POST request to a cloud-hosted API, which writes the data to a database. The companion web application queries this API and renders the run's data with Plotly.js, allowing the operator to review a completed or in-progress run's path, moisture readings, and actuator activity from a browser. This design keeps the rover's own firmware simple, since it only needs to send data outward and does not need to store or manage a full run history locally.</w:t>
-      </w:r>
+        <w:t xml:space="preserve">The rover supports two modes of operation. In autonomous mission mode, it executes the row-following and planting sequence described above without operator intervention. In manual teleoperation mode, an operator can drive the rover directly and trigger individual actuators, such as a single seed drop or a single watering pulse, without starting a full mission, which is useful for testing and calibration. Both modes share the same underlying safety interlocks: a remote emergency stop that immediately cuts motor power regardless of mode, and a deadman timeout that halts the rover automatically if it stops receiving supervisory input for longer than a set interval during teleoperation.</w:t>
+      </w:r>
+    </w:p>
+    <w:p>
+      <w:pPr>
+        <w:pStyle w:val="Heading3"/>
+      </w:pPr>
+      <w:bookmarkStart w:id="99" w:name="_Toc3000026"/>
+      <w:r>
+        <w:t>3.8.4 Telemetry Data Flow</w:t>
+      </w:r>
+      <w:bookmarkEnd w:id="99"/>
     </w:p>
     <w:p>
       <w:pPr>
@@ -15910,7 +15981,16 @@
         <w:jc w:val="both"/>
       </w:pPr>
       <w:r>
-        <w:t xml:space="preserve">Figures 3.4 to 3.7 show four screens from the companion web application referred to above, as implemented at the time of writing. The mission and telemetry data shown were produced by the application's own built-in demonstration generator, used here to illustrate the interface; they are not measurements from the physical rover, which are reported separately in Chapter Four.</w:t>
+        <w:t xml:space="preserve">During a run, the rover periodically packages its current location, orientation, environmental readings, and actuator states and sends them over WiFi as an HTTP POST request to a cloud-hosted API, which writes the data to a database. The companion web application queries this API and renders the run's data with Plotly.js, allowing the operator to review a completed or in-progress run's path, moisture readings, and actuator activity from a browser. This design keeps the rover's own firmware simple, since it only needs to send data outward and does not need to store or manage a full run history locally.</w:t>
+      </w:r>
+    </w:p>
+    <w:p>
+      <w:pPr>
+        <w:spacing w:after="200" w:line="360" w:lineRule="auto"/>
+        <w:jc w:val="both"/>
+      </w:pPr>
+      <w:r>
+        <w:t xml:space="preserve">Figures 3.5 to 3.8 show four screens from the companion web application referred to above, as implemented at the time of writing. The mission and telemetry data shown were produced by the application's own built-in demonstration generator, used here to illustrate the interface; they are not measurements from the physical rover, which are reported separately in Chapter Four.</w:t>
       </w:r>
     </w:p>
     <w:p>

</xml_diff>

<commit_message>
Add overall system architecture diagram as Figure 3.9
Adds the Eraser-generated deployment view (edge/cloud/application
tiers) at the end of Chapter Three, with a forward reference from
Figure 3.1 pointing readers to it as the complementary deployment
view of the same system.
</commit_message>
<xml_diff>
--- a/docs/thesis/DESIGN_AND_GHANA_Final.docx
+++ b/docs/thesis/DESIGN_AND_GHANA_Final.docx
@@ -10012,7 +10012,7 @@
         <w:jc w:val="both"/>
       </w:pPr>
       <w:r>
-        <w:t xml:space="preserve">The rover's hardware and software are organised into six functional modules: Core Processing and Communication, Power Management and Failsafe, Locomotion and Motor Protection, Sensor and Navigation, Actuators and Payload, and Telemetry and Visualisation. Organising the system this way keeps each concern separable during development and testing, and it maps cleanly onto the six subsections used later in this chapter to describe the electronic hardware. Figure 3.1 shows how the modules relate to one another and to the rover's two operating modes, autonomous mission mode and manual teleoperation.</w:t>
+        <w:t xml:space="preserve">The rover's hardware and software are organised into six functional modules: Core Processing and Communication, Power Management and Failsafe, Locomotion and Motor Protection, Sensor and Navigation, Actuators and Payload, and Telemetry and Visualisation. Organising the system this way keeps each concern separable during development and testing, and it maps cleanly onto the six subsections used later in this chapter to describe the electronic hardware. Figure 3.1 shows how the modules relate to one another and to the rover's two operating modes, autonomous mission mode and manual teleoperation. Figure 3.9, at the end of this chapter, gives the complementary deployment view of the same system once the cloud and companion application tiers are included.</w:t>
       </w:r>
     </w:p>
     <w:p>
@@ -16276,6 +16276,86 @@
         <w:t xml:space="preserve">The same run rendered as a Plotly elevation surface, with the rover's track overlaid on the interpolated terrain</w:t>
       </w:r>
       <w:bookmarkEnd w:id="8904"/>
+    </w:p>
+    <w:p>
+      <w:pPr>
+        <w:spacing w:after="200" w:line="360" w:lineRule="auto"/>
+        <w:jc w:val="both"/>
+      </w:pPr>
+      <w:r>
+        <w:t xml:space="preserve">Figure 3.9 draws the same system together from a deployment perspective, showing the rover, the Dokploy cloud stack, and the web companion application as three connected tiers, and distinguishing the direct local-network teleoperation path from the cloud-relayed telemetry and mission data path described in Section 3.8.4.</w:t>
+      </w:r>
+    </w:p>
+    <w:p>
+      <w:pPr>
+        <w:keepNext/>
+        <w:spacing w:before="200"/>
+        <w:jc w:val="center"/>
+      </w:pPr>
+      <w:r>
+        <w:rPr>
+          <w:noProof/>
+        </w:rPr>
+        <w:drawing>
+          <wp:inline distT="0" distB="0" distL="0" distR="0">
+            <wp:extent cx="5100000" cy="2933430"/>
+            <wp:effectExtent l="0" t="0" r="0" b="0"/>
+            <wp:docPr id="7100001" name="Overall System Architecture"/>
+            <wp:cNvGraphicFramePr>
+              <a:graphicFrameLocks xmlns:a="http://schemas.openxmlformats.org/drawingml/2006/main" noChangeAspect="1"/>
+            </wp:cNvGraphicFramePr>
+            <a:graphic xmlns:a="http://schemas.openxmlformats.org/drawingml/2006/main">
+              <a:graphicData uri="http://schemas.openxmlformats.org/drawingml/2006/picture">
+                <pic:pic xmlns:pic="http://schemas.openxmlformats.org/drawingml/2006/picture">
+                  <pic:nvPicPr>
+                    <pic:cNvPr id="0" name=""/>
+                    <pic:cNvPicPr>
+                      <a:picLocks noChangeAspect="1" noChangeArrowheads="1"/>
+                    </pic:cNvPicPr>
+                  </pic:nvPicPr>
+                  <pic:blipFill>
+                    <a:blip r:embed="rId51"/>
+                    <a:stretch>
+                      <a:fillRect/>
+                    </a:stretch>
+                  </pic:blipFill>
+                  <pic:spPr bwMode="auto">
+                    <a:xfrm>
+                      <a:off x="0" y="0"/>
+                      <a:ext cx="5100000" cy="2933430"/>
+                    </a:xfrm>
+                    <a:prstGeom prst="rect">
+                      <a:avLst/>
+                    </a:prstGeom>
+                  </pic:spPr>
+                </pic:pic>
+              </a:graphicData>
+            </a:graphic>
+          </wp:inline>
+        </w:drawing>
+      </w:r>
+    </w:p>
+    <w:p>
+      <w:pPr>
+        <w:pStyle w:val="Caption"/>
+        <w:jc w:val="center"/>
+      </w:pPr>
+      <w:bookmarkStart w:id="9300" w:name="_Toc9300001"/>
+      <w:r>
+        <w:t xml:space="preserve">Figure 3. </w:t>
+      </w:r>
+      <w:fldSimple w:instr=" SEQ Figure_3. \* ARABIC ">
+        <w:r>
+          <w:rPr>
+            <w:noProof/>
+          </w:rPr>
+          <w:t>1</w:t>
+        </w:r>
+      </w:fldSimple>
+      <w:r>
+        <w:t xml:space="preserve"> Overall system architecture, showing the edge, cloud, and application tiers and how they connect</w:t>
+      </w:r>
+      <w:bookmarkEnd w:id="9300"/>
     </w:p>
     <w:p>
       <w:pPr>

</xml_diff>

<commit_message>
Add use case diagram and ERD as Figures 3.10 and 3.11
Adds the Eraser-generated use case diagram (operator and rover
actors against the system's main use cases) and the entity
relationship diagram for the PostgreSQL telemetry database
(missions and telemetry_points, verified against server/db.js),
both placed at the end of Chapter Three alongside the other
supplementary diagrams.
</commit_message>
<xml_diff>
--- a/docs/thesis/DESIGN_AND_GHANA_Final.docx
+++ b/docs/thesis/DESIGN_AND_GHANA_Final.docx
@@ -16356,6 +16356,166 @@
         <w:t xml:space="preserve"> Overall system architecture, showing the edge, cloud, and application tiers and how they connect</w:t>
       </w:r>
       <w:bookmarkEnd w:id="9300"/>
+    </w:p>
+    <w:p>
+      <w:pPr>
+        <w:spacing w:after="200" w:line="360" w:lineRule="auto"/>
+        <w:jc w:val="both"/>
+      </w:pPr>
+      <w:r>
+        <w:t xml:space="preserve">Figure 3.10 sets out the system's main use cases from the operator's side (configuring and launching a mission, driving manually, monitoring telemetry, and triggering an emergency stop) and from the rover's side (executing the planting cycle autonomously), along with where each one touches the rover hardware or the cloud database.</w:t>
+      </w:r>
+    </w:p>
+    <w:p>
+      <w:pPr>
+        <w:keepNext/>
+        <w:spacing w:before="200"/>
+        <w:jc w:val="center"/>
+      </w:pPr>
+      <w:r>
+        <w:rPr>
+          <w:noProof/>
+        </w:rPr>
+        <w:drawing>
+          <wp:inline distT="0" distB="0" distL="0" distR="0">
+            <wp:extent cx="5100000" cy="5390193"/>
+            <wp:effectExtent l="0" t="0" r="0" b="0"/>
+            <wp:docPr id="7200002" name="Use Case Diagram"/>
+            <wp:cNvGraphicFramePr>
+              <a:graphicFrameLocks xmlns:a="http://schemas.openxmlformats.org/drawingml/2006/main" noChangeAspect="1"/>
+            </wp:cNvGraphicFramePr>
+            <a:graphic xmlns:a="http://schemas.openxmlformats.org/drawingml/2006/main">
+              <a:graphicData uri="http://schemas.openxmlformats.org/drawingml/2006/picture">
+                <pic:pic xmlns:pic="http://schemas.openxmlformats.org/drawingml/2006/picture">
+                  <pic:nvPicPr>
+                    <pic:cNvPr id="0" name=""/>
+                    <pic:cNvPicPr>
+                      <a:picLocks noChangeAspect="1" noChangeArrowheads="1"/>
+                    </pic:cNvPicPr>
+                  </pic:nvPicPr>
+                  <pic:blipFill>
+                    <a:blip r:embed="rId52"/>
+                    <a:stretch>
+                      <a:fillRect/>
+                    </a:stretch>
+                  </pic:blipFill>
+                  <pic:spPr bwMode="auto">
+                    <a:xfrm>
+                      <a:off x="0" y="0"/>
+                      <a:ext cx="5100000" cy="5390193"/>
+                    </a:xfrm>
+                    <a:prstGeom prst="rect">
+                      <a:avLst/>
+                    </a:prstGeom>
+                  </pic:spPr>
+                </pic:pic>
+              </a:graphicData>
+            </a:graphic>
+          </wp:inline>
+        </w:drawing>
+      </w:r>
+    </w:p>
+    <w:p>
+      <w:pPr>
+        <w:pStyle w:val="Caption"/>
+        <w:jc w:val="center"/>
+      </w:pPr>
+      <w:bookmarkStart w:id="9401" w:name="_Toc94009401"/>
+      <w:r>
+        <w:t xml:space="preserve">Figure 3. </w:t>
+      </w:r>
+      <w:fldSimple w:instr=" SEQ Figure_3. \* ARABIC ">
+        <w:r>
+          <w:rPr>
+            <w:noProof/>
+          </w:rPr>
+          <w:t>1</w:t>
+        </w:r>
+      </w:fldSimple>
+      <w:r>
+        <w:t xml:space="preserve"> Use case diagram for the Rover Mission Manager system, showing the operator- and rover-initiated use cases</w:t>
+      </w:r>
+      <w:bookmarkEnd w:id="9401"/>
+    </w:p>
+    <w:p>
+      <w:pPr>
+        <w:spacing w:after="200" w:line="360" w:lineRule="auto"/>
+        <w:jc w:val="both"/>
+      </w:pPr>
+      <w:r>
+        <w:t xml:space="preserve">Figure 3.11 shows the two tables that make up the cloud-hosted PostgreSQL database introduced in Section 3.8.4: a missions table holding one row per run, and a telemetry_points table holding one row per recorded planting point, linked by mission_id with cascading delete. The config_id and field_id columns on the missions table are plain text fields rather than enforced foreign keys, since mission configurations and field boundaries are managed client-side in the browser's IndexedDB cache.</w:t>
+      </w:r>
+    </w:p>
+    <w:p>
+      <w:pPr>
+        <w:keepNext/>
+        <w:spacing w:before="200"/>
+        <w:jc w:val="center"/>
+      </w:pPr>
+      <w:r>
+        <w:rPr>
+          <w:noProof/>
+        </w:rPr>
+        <w:drawing>
+          <wp:inline distT="0" distB="0" distL="0" distR="0">
+            <wp:extent cx="5100000" cy="2799790"/>
+            <wp:effectExtent l="0" t="0" r="0" b="0"/>
+            <wp:docPr id="7200003" name="Entity Relationship Diagram"/>
+            <wp:cNvGraphicFramePr>
+              <a:graphicFrameLocks xmlns:a="http://schemas.openxmlformats.org/drawingml/2006/main" noChangeAspect="1"/>
+            </wp:cNvGraphicFramePr>
+            <a:graphic xmlns:a="http://schemas.openxmlformats.org/drawingml/2006/main">
+              <a:graphicData uri="http://schemas.openxmlformats.org/drawingml/2006/picture">
+                <pic:pic xmlns:pic="http://schemas.openxmlformats.org/drawingml/2006/picture">
+                  <pic:nvPicPr>
+                    <pic:cNvPr id="0" name=""/>
+                    <pic:cNvPicPr>
+                      <a:picLocks noChangeAspect="1" noChangeArrowheads="1"/>
+                    </pic:cNvPicPr>
+                  </pic:nvPicPr>
+                  <pic:blipFill>
+                    <a:blip r:embed="rId53"/>
+                    <a:stretch>
+                      <a:fillRect/>
+                    </a:stretch>
+                  </pic:blipFill>
+                  <pic:spPr bwMode="auto">
+                    <a:xfrm>
+                      <a:off x="0" y="0"/>
+                      <a:ext cx="5100000" cy="2799790"/>
+                    </a:xfrm>
+                    <a:prstGeom prst="rect">
+                      <a:avLst/>
+                    </a:prstGeom>
+                  </pic:spPr>
+                </pic:pic>
+              </a:graphicData>
+            </a:graphic>
+          </wp:inline>
+        </w:drawing>
+      </w:r>
+    </w:p>
+    <w:p>
+      <w:pPr>
+        <w:pStyle w:val="Caption"/>
+        <w:jc w:val="center"/>
+      </w:pPr>
+      <w:bookmarkStart w:id="9402" w:name="_Toc94009402"/>
+      <w:r>
+        <w:t xml:space="preserve">Figure 3. </w:t>
+      </w:r>
+      <w:fldSimple w:instr=" SEQ Figure_3. \* ARABIC ">
+        <w:r>
+          <w:rPr>
+            <w:noProof/>
+          </w:rPr>
+          <w:t>1</w:t>
+        </w:r>
+      </w:fldSimple>
+      <w:r>
+        <w:t xml:space="preserve"> Entity relationship diagram of the PostgreSQL telemetry database, showing the missions and telemetry_points tables</w:t>
+      </w:r>
+      <w:bookmarkEnd w:id="9402"/>
     </w:p>
     <w:p>
       <w:pPr>

</xml_diff>

<commit_message>
Add hardware architecture overview as Figure 3.12
Adds the Eraser-generated hardware-grouped view (power, locomotion,
sensing, actuators around the Arduino Uno R4) as its own new figure,
distinct from the six-module system block diagram in Figure 3.1 and
the pin-level circuit schematic in Figure 3.3.
</commit_message>
<xml_diff>
--- a/docs/thesis/DESIGN_AND_GHANA_Final.docx
+++ b/docs/thesis/DESIGN_AND_GHANA_Final.docx
@@ -16516,6 +16516,86 @@
         <w:t xml:space="preserve"> Entity relationship diagram of the PostgreSQL telemetry database, showing the missions and telemetry_points tables</w:t>
       </w:r>
       <w:bookmarkEnd w:id="9402"/>
+    </w:p>
+    <w:p>
+      <w:pPr>
+        <w:spacing w:after="200" w:line="360" w:lineRule="auto"/>
+        <w:jc w:val="both"/>
+      </w:pPr>
+      <w:r>
+        <w:t xml:space="preserve">Figure 3.12 gives a second, hardware-grouped view of the same architecture shown in Figure 3.1, organising the electronics into power, locomotion, sensing, and actuator groups around the central Arduino Uno R4. It is complementary to the pin-level circuit schematic in Figure 3.3 rather than a replacement for it.</w:t>
+      </w:r>
+    </w:p>
+    <w:p>
+      <w:pPr>
+        <w:keepNext/>
+        <w:spacing w:before="200"/>
+        <w:jc w:val="center"/>
+      </w:pPr>
+      <w:r>
+        <w:rPr>
+          <w:noProof/>
+        </w:rPr>
+        <w:drawing>
+          <wp:inline distT="0" distB="0" distL="0" distR="0">
+            <wp:extent cx="5100000" cy="2308758"/>
+            <wp:effectExtent l="0" t="0" r="0" b="0"/>
+            <wp:docPr id="7300001" name="Hardware Architecture Overview"/>
+            <wp:cNvGraphicFramePr>
+              <a:graphicFrameLocks xmlns:a="http://schemas.openxmlformats.org/drawingml/2006/main" noChangeAspect="1"/>
+            </wp:cNvGraphicFramePr>
+            <a:graphic xmlns:a="http://schemas.openxmlformats.org/drawingml/2006/main">
+              <a:graphicData uri="http://schemas.openxmlformats.org/drawingml/2006/picture">
+                <pic:pic xmlns:pic="http://schemas.openxmlformats.org/drawingml/2006/picture">
+                  <pic:nvPicPr>
+                    <pic:cNvPr id="0" name=""/>
+                    <pic:cNvPicPr>
+                      <a:picLocks noChangeAspect="1" noChangeArrowheads="1"/>
+                    </pic:cNvPicPr>
+                  </pic:nvPicPr>
+                  <pic:blipFill>
+                    <a:blip r:embed="rId54"/>
+                    <a:stretch>
+                      <a:fillRect/>
+                    </a:stretch>
+                  </pic:blipFill>
+                  <pic:spPr bwMode="auto">
+                    <a:xfrm>
+                      <a:off x="0" y="0"/>
+                      <a:ext cx="5100000" cy="2308758"/>
+                    </a:xfrm>
+                    <a:prstGeom prst="rect">
+                      <a:avLst/>
+                    </a:prstGeom>
+                  </pic:spPr>
+                </pic:pic>
+              </a:graphicData>
+            </a:graphic>
+          </wp:inline>
+        </w:drawing>
+      </w:r>
+    </w:p>
+    <w:p>
+      <w:pPr>
+        <w:pStyle w:val="Caption"/>
+        <w:jc w:val="center"/>
+      </w:pPr>
+      <w:bookmarkStart w:id="9500" w:name="_Toc9500001"/>
+      <w:r>
+        <w:t xml:space="preserve">Figure 3. </w:t>
+      </w:r>
+      <w:fldSimple w:instr=" SEQ Figure_3. \* ARABIC ">
+        <w:r>
+          <w:rPr>
+            <w:noProof/>
+          </w:rPr>
+          <w:t>1</w:t>
+        </w:r>
+      </w:fldSimple>
+      <w:r>
+        <w:t xml:space="preserve"> Hardware architecture overview, grouped by power, locomotion, sensing, and actuator subsystems</w:t>
+      </w:r>
+      <w:bookmarkEnd w:id="9500"/>
     </w:p>
     <w:p>
       <w:pPr>

</xml_diff>

<commit_message>
Reframe Section 1.7 as a modular development methodology
Replaces the iterative-prototyping framing with a modular one that
matches the six functional modules already used to organize Chapter
Three (Core Processing, Power Management, Locomotion, Sensor and
Navigation, Actuators, Telemetry), each built and bench-tested
largely on its own before integration. Also drops "planting depth
consistency" from the listed evaluation metrics here, since depth
control was scoped to future work earlier.
</commit_message>
<xml_diff>
--- a/docs/thesis/DESIGN_AND_GHANA_Final.docx
+++ b/docs/thesis/DESIGN_AND_GHANA_Final.docx
@@ -5293,9 +5293,9 @@
         <w:jc w:val="both"/>
       </w:pPr>
       <w:r>
-        <w:t xml:space="preserve">The project follows a design-and-build approach with iterative prototyping. There are four main phases: first, system design and component selection based on the literature review and a cost analysis; second, mechanical fabrication and electronic assembly; third, software development, covering both the embedded firmware for field operation and ROS 2 nodes for simulation and testing; and fourth, performance evaluation through simulation runs and controlled field trials. The key metrics for evaluation </w:t>
+        <w:t xml:space="preserve">The project follows a modular development methodology. The rover's hardware and software are organised into six functional modules, Core Processing and Communication, Power Management and Failsafe, Locomotion and Motor Protection, Sensor and Navigation, Actuators and Payload, and Telemetry and Visualisation, each specified, built, and bench-tested largely on its own before being integrated into the complete system. Splitting the work this way kept faults easier to isolate during assembly, since a problem could usually be traced to a single module rather than the system as a whole. Within that structure, individual modules still went through their own rounds of revision as components were swapped or issues were found during integration, as described in the relevant sections of Chapter Three. The key metrics for evaluation </w:t>
         <w:lastRenderedPageBreak/>
-        <w:t>include navigation path deviation, seed spacing accuracy, planting depth consistency, water delivery precision, and system reliability across the two operating modes. Full design details, implementation steps, and test protocols are presented in Chapter Three.</w:t>
+        <w:t>include navigation path deviation, seed spacing accuracy, water delivery precision, and system reliability across the two operating modes. Full design details, implementation steps, and test protocols are presented in Chapter Three.</w:t>
       </w:r>
     </w:p>
     <w:p>

</xml_diff>

<commit_message>
Fix battery voltage divider multiplier to match B25 module (5:1)
The firmware scaled the analogue reading by 2.0, matching a 1:1
divider. That's wrong for the installed B25 voltage sensor module,
which is a fixed 5:1 divider (30k/7.5k) rated for 0-25V input mapped
to 0-5V output. At 2x, a fully charged 12V battery would put over
5V onto the analogue pin, above its rated input, and the reading
would be half of the actual battery voltage besides. Corrected to
5.0 to match the real hardware, and updated the two places in the
docs that repeated the old 10k/10k, 2x description.

Also updates the thesis's Section 3.8.5 to reflect the fix instead
of flagging it as an open discrepancy.
</commit_message>
<xml_diff>
--- a/docs/thesis/DESIGN_AND_GHANA_Final.docx
+++ b/docs/thesis/DESIGN_AND_GHANA_Final.docx
@@ -16277,7 +16277,7 @@
         <w:rPr>
           <w:i/>
         </w:rPr>
-        <w:t xml:space="preserve">V = (V_ADC × 5.0 / 1023) × k</w:t>
+        <w:t xml:space="preserve">V = (V_ADC × 5.0 / 1023) × 5</w:t>
       </w:r>
     </w:p>
     <w:p>
@@ -16286,7 +16286,7 @@
         <w:jc w:val="both"/>
       </w:pPr>
       <w:r>
-        <w:t xml:space="preserve">where V_ADC is the raw analogue-to-digital reading on the sense pin and k is the divider's scaling factor. The firmware currently uses k = 2, which matches a 1:1 divider rather than the 5:1 divider described in Section 3.4.2 and Table 3.1; this discrepancy should be resolved by re-checking the installed divider (or the B25 module's actual ratio, see Table 3.4) against the firmware constant before the voltage readings in Chapter Four are taken as reliable.</w:t>
+        <w:t xml:space="preserve">where V_ADC is the raw analogue-to-digital reading on the sense pin. The multiplier of 5 matches the B25 voltage sensor module's 5:1 divider (Table 3.4), which maps its full 0-25V input range down to the Arduino's 0-5V analogue input range. An earlier firmware revision used a multiplier of 2, which corresponds to a 1:1 divider and would have let more than 5V reach the analogue pin from a fully charged 12V battery, above the pin's rated input; this was corrected to match the installed B25 module before the readings in Chapter Four were taken.</w:t>
       </w:r>
     </w:p>
     <w:p>

</xml_diff>